<commit_message>
"Curso Nivel 1 renombrado: Primeras Palabras (web + syllabus)"
</commit_message>
<xml_diff>
--- a/A1_Nivel_1/Programa_Curso_Nivel1_A1_AcademiaSeul.docx
+++ b/A1_Nivel_1/Programa_Curso_Nivel1_A1_AcademiaSeul.docx
@@ -93,7 +93,7 @@
           <w:sz w:val="30"/>
           <w:szCs w:val="30"/>
         </w:rPr>
-        <w:t xml:space="preserve">Coreano · Nivel 1 (A1) — Iniciación</w:t>
+        <w:t xml:space="preserve">Coreano · Nivel 1 (A1) — Primeras Palabras</w:t>
       </w:r>
     </w:p>
     <w:p>
@@ -308,7 +308,7 @@
                 <w:bCs/>
                 <w:color w:val="1A1A2E"/>
               </w:rPr>
-              <w:t xml:space="preserve">Código del curso</w:t>
+              <w:t xml:space="preserve">Curso</w:t>
             </w:r>
           </w:p>
         </w:tc>
@@ -336,7 +336,7 @@
               <w:jc w:val="left"/>
             </w:pPr>
             <w:r>
-              <w:t xml:space="preserve">AS-KOR-101</w:t>
+              <w:t xml:space="preserve">Coreano Nivel 1 (A1) — Primeras Palabras</w:t>
             </w:r>
           </w:p>
         </w:tc>
@@ -371,7 +371,7 @@
                 <w:bCs/>
                 <w:color w:val="1A1A2E"/>
               </w:rPr>
-              <w:t xml:space="preserve">Nivel</w:t>
+              <w:t xml:space="preserve">Código del curso</w:t>
             </w:r>
           </w:p>
         </w:tc>
@@ -399,7 +399,7 @@
               <w:jc w:val="left"/>
             </w:pPr>
             <w:r>
-              <w:t xml:space="preserve">MCER A1 (Iniciación) · base para el examen TOPIK I</w:t>
+              <w:t xml:space="preserve">AS-KOR-101</w:t>
             </w:r>
           </w:p>
         </w:tc>
@@ -434,7 +434,7 @@
                 <w:bCs/>
                 <w:color w:val="1A1A2E"/>
               </w:rPr>
-              <w:t xml:space="preserve">Modalidad</w:t>
+              <w:t xml:space="preserve">Nivel</w:t>
             </w:r>
           </w:p>
         </w:tc>
@@ -462,7 +462,7 @@
               <w:jc w:val="left"/>
             </w:pPr>
             <w:r>
-              <w:t xml:space="preserve">En vivo por videoconferencia (Zoom)</w:t>
+              <w:t xml:space="preserve">MCER A1 (Iniciación) · base para el examen TOPIK I</w:t>
             </w:r>
           </w:p>
         </w:tc>
@@ -497,7 +497,7 @@
                 <w:bCs/>
                 <w:color w:val="1A1A2E"/>
               </w:rPr>
-              <w:t xml:space="preserve">Duración</w:t>
+              <w:t xml:space="preserve">Modalidad</w:t>
             </w:r>
           </w:p>
         </w:tc>
@@ -525,7 +525,7 @@
               <w:jc w:val="left"/>
             </w:pPr>
             <w:r>
-              <w:t xml:space="preserve">11 sesiones · 90 minutos cada una (16,5 horas lectivas)</w:t>
+              <w:t xml:space="preserve">En vivo por videoconferencia (Zoom)</w:t>
             </w:r>
           </w:p>
         </w:tc>
@@ -560,7 +560,7 @@
                 <w:bCs/>
                 <w:color w:val="1A1A2E"/>
               </w:rPr>
-              <w:t xml:space="preserve">Cupos</w:t>
+              <w:t xml:space="preserve">Duración</w:t>
             </w:r>
           </w:p>
         </w:tc>
@@ -588,7 +588,7 @@
               <w:jc w:val="left"/>
             </w:pPr>
             <w:r>
-              <w:t xml:space="preserve">Grupos reducidos (máximo 15 estudiantes)</w:t>
+              <w:t xml:space="preserve">11 sesiones · 90 minutos cada una (16,5 horas lectivas)</w:t>
             </w:r>
           </w:p>
         </w:tc>
@@ -623,7 +623,7 @@
                 <w:bCs/>
                 <w:color w:val="1A1A2E"/>
               </w:rPr>
-              <w:t xml:space="preserve">Idioma de instrucción</w:t>
+              <w:t xml:space="preserve">Cupos</w:t>
             </w:r>
           </w:p>
         </w:tc>
@@ -651,7 +651,7 @@
               <w:jc w:val="left"/>
             </w:pPr>
             <w:r>
-              <w:t xml:space="preserve">Español, con inmersión progresiva en coreano</w:t>
+              <w:t xml:space="preserve">Grupos reducidos (máximo 15 estudiantes)</w:t>
             </w:r>
           </w:p>
         </w:tc>
@@ -686,7 +686,7 @@
                 <w:bCs/>
                 <w:color w:val="1A1A2E"/>
               </w:rPr>
-              <w:t xml:space="preserve">Requisitos</w:t>
+              <w:t xml:space="preserve">Idioma de instrucción</w:t>
             </w:r>
           </w:p>
         </w:tc>
@@ -714,7 +714,7 @@
               <w:jc w:val="left"/>
             </w:pPr>
             <w:r>
-              <w:t xml:space="preserve">Ninguno. No se requiere conocimiento previo del coreano</w:t>
+              <w:t xml:space="preserve">Español, con inmersión progresiva en coreano</w:t>
             </w:r>
           </w:p>
         </w:tc>
@@ -749,7 +749,7 @@
                 <w:bCs/>
                 <w:color w:val="1A1A2E"/>
               </w:rPr>
-              <w:t xml:space="preserve">Profesor</w:t>
+              <w:t xml:space="preserve">Requisitos</w:t>
             </w:r>
           </w:p>
         </w:tc>
@@ -777,17 +777,7 @@
               <w:jc w:val="left"/>
             </w:pPr>
             <w:r>
-              <w:t xml:space="preserve">Jay Kim (</w:t>
-            </w:r>
-            <w:r>
-              <w:rPr>
-                <w:rFonts w:ascii="Malgun Gothic" w:cs="Malgun Gothic" w:eastAsia="Malgun Gothic" w:hAnsi="Malgun Gothic"/>
-                <w:color w:val="000000"/>
-              </w:rPr>
-              <w:t xml:space="preserve">김재희</w:t>
-            </w:r>
-            <w:r>
-              <w:t xml:space="preserve">) — Fundador y profesor titular</w:t>
+              <w:t xml:space="preserve">Ninguno. No se requiere conocimiento previo del coreano</w:t>
             </w:r>
           </w:p>
         </w:tc>
@@ -822,6 +812,79 @@
                 <w:bCs/>
                 <w:color w:val="1A1A2E"/>
               </w:rPr>
+              <w:t xml:space="preserve">Profesor</w:t>
+            </w:r>
+          </w:p>
+        </w:tc>
+        <w:tc>
+          <w:tcPr>
+            <w:tcW w:type="dxa" w:w="6560"/>
+            <w:tcBorders>
+              <w:top w:val="single" w:color="D9D5F2" w:sz="2"/>
+              <w:left w:val="single" w:color="D9D5F2" w:sz="2"/>
+              <w:bottom w:val="single" w:color="D9D5F2" w:sz="2"/>
+              <w:right w:val="single" w:color="D9D5F2" w:sz="2"/>
+            </w:tcBorders>
+            <w:shd w:fill="FFFFFF" w:val="clear"/>
+            <w:tcMar>
+              <w:top w:type="dxa" w:w="70"/>
+              <w:left w:type="dxa" w:w="120"/>
+              <w:bottom w:type="dxa" w:w="70"/>
+              <w:right w:type="dxa" w:w="120"/>
+            </w:tcMar>
+            <w:vAlign w:val="center"/>
+          </w:tcPr>
+          <w:p>
+            <w:pPr>
+              <w:spacing w:after="0"/>
+              <w:jc w:val="left"/>
+            </w:pPr>
+            <w:r>
+              <w:t xml:space="preserve">Jay Kim (</w:t>
+            </w:r>
+            <w:r>
+              <w:rPr>
+                <w:rFonts w:ascii="Malgun Gothic" w:cs="Malgun Gothic" w:eastAsia="Malgun Gothic" w:hAnsi="Malgun Gothic"/>
+                <w:color w:val="000000"/>
+              </w:rPr>
+              <w:t xml:space="preserve">김재희</w:t>
+            </w:r>
+            <w:r>
+              <w:t xml:space="preserve">) — Fundador y profesor titular</w:t>
+            </w:r>
+          </w:p>
+        </w:tc>
+      </w:tr>
+      <w:tr>
+        <w:tc>
+          <w:tcPr>
+            <w:tcW w:type="dxa" w:w="2800"/>
+            <w:tcBorders>
+              <w:top w:val="single" w:color="D9D5F2" w:sz="2"/>
+              <w:left w:val="single" w:color="D9D5F2" w:sz="2"/>
+              <w:bottom w:val="single" w:color="D9D5F2" w:sz="2"/>
+              <w:right w:val="single" w:color="D9D5F2" w:sz="2"/>
+            </w:tcBorders>
+            <w:shd w:fill="EEEBFB" w:val="clear"/>
+            <w:tcMar>
+              <w:top w:type="dxa" w:w="70"/>
+              <w:left w:type="dxa" w:w="120"/>
+              <w:bottom w:type="dxa" w:w="70"/>
+              <w:right w:type="dxa" w:w="120"/>
+            </w:tcMar>
+            <w:vAlign w:val="center"/>
+          </w:tcPr>
+          <w:p>
+            <w:pPr>
+              <w:spacing w:after="0"/>
+              <w:jc w:val="left"/>
+            </w:pPr>
+            <w:r>
+              <w:rPr>
+                <w:b/>
+                <w:bCs/>
+                <w:color w:val="1A1A2E"/>
+              </w:rPr>
               <w:t xml:space="preserve">Inicio</w:t>
             </w:r>
           </w:p>
@@ -875,7 +938,7 @@
         <w:jc w:val="both"/>
       </w:pPr>
       <w:r>
-        <w:t xml:space="preserve">El Coreano Nivel 1 (A1) es un curso de iniciación al idioma coreano diseñado específicamente para hispanohablantes, bajo el Método Chingu™ de Academia Seúl. Su propósito es llevar al estudiante desde cero —comenzando por la lectura del alfabeto </w:t>
+        <w:t xml:space="preserve">El Nivel 1 (A1) «Primeras Palabras» es un curso de iniciación al idioma coreano diseñado específicamente para hispanohablantes, bajo el Método Chingu™ de Academia Seúl. Su propósito es llevar al estudiante desde cero —comenzando por la lectura del alfabeto </w:t>
       </w:r>
       <w:r>
         <w:rPr>

</xml_diff>

<commit_message>
Cerrar inscripciones a cohorte en curso, apuntar a lista de espera
</commit_message>
<xml_diff>
--- a/A1_Nivel_1/Programa_Curso_Nivel1_A1_AcademiaSeul.docx
+++ b/A1_Nivel_1/Programa_Curso_Nivel1_A1_AcademiaSeul.docx
@@ -107,7 +107,6 @@
         <w:spacing w:after="30"/>
         <w:jc w:val="center"/>
         <w:rPr>
-          <w:rFonts w:hint="eastAsia"/>
           <w:color w:val="000000" w:themeColor="text1"/>
         </w:rPr>
       </w:pPr>
@@ -342,11 +341,7 @@
           </w:pPr>
           <w:r>
             <w:fldChar w:fldCharType="begin"/>
-          </w:r>
-          <w:r>
             <w:instrText>TOC \h \o "1-1"</w:instrText>
-          </w:r>
-          <w:r>
             <w:fldChar w:fldCharType="separate"/>
           </w:r>
           <w:hyperlink w:anchor="_Toc233093052" w:history="1">
@@ -362,40 +357,10 @@
                 <w:noProof/>
               </w:rPr>
               <w:tab/>
-            </w:r>
-            <w:r>
-              <w:rPr>
-                <w:noProof/>
-              </w:rPr>
               <w:fldChar w:fldCharType="begin"/>
-            </w:r>
-            <w:r>
-              <w:rPr>
-                <w:noProof/>
-              </w:rPr>
               <w:instrText xml:space="preserve"> PAGEREF _Toc233093052 \h </w:instrText>
-            </w:r>
-            <w:r>
-              <w:rPr>
-                <w:noProof/>
-              </w:rPr>
-            </w:r>
-            <w:r>
-              <w:rPr>
-                <w:noProof/>
-              </w:rPr>
               <w:fldChar w:fldCharType="separate"/>
-            </w:r>
-            <w:r>
-              <w:rPr>
-                <w:noProof/>
-              </w:rPr>
               <w:t>2</w:t>
-            </w:r>
-            <w:r>
-              <w:rPr>
-                <w:noProof/>
-              </w:rPr>
               <w:fldChar w:fldCharType="end"/>
             </w:r>
           </w:hyperlink>
@@ -423,40 +388,10 @@
                 <w:noProof/>
               </w:rPr>
               <w:tab/>
-            </w:r>
-            <w:r>
-              <w:rPr>
-                <w:noProof/>
-              </w:rPr>
               <w:fldChar w:fldCharType="begin"/>
-            </w:r>
-            <w:r>
-              <w:rPr>
-                <w:noProof/>
-              </w:rPr>
               <w:instrText xml:space="preserve"> PAGEREF _Toc233093053 \h </w:instrText>
-            </w:r>
-            <w:r>
-              <w:rPr>
-                <w:noProof/>
-              </w:rPr>
-            </w:r>
-            <w:r>
-              <w:rPr>
-                <w:noProof/>
-              </w:rPr>
               <w:fldChar w:fldCharType="separate"/>
-            </w:r>
-            <w:r>
-              <w:rPr>
-                <w:noProof/>
-              </w:rPr>
               <w:t>3</w:t>
-            </w:r>
-            <w:r>
-              <w:rPr>
-                <w:noProof/>
-              </w:rPr>
               <w:fldChar w:fldCharType="end"/>
             </w:r>
           </w:hyperlink>
@@ -484,40 +419,10 @@
                 <w:noProof/>
               </w:rPr>
               <w:tab/>
-            </w:r>
-            <w:r>
-              <w:rPr>
-                <w:noProof/>
-              </w:rPr>
               <w:fldChar w:fldCharType="begin"/>
-            </w:r>
-            <w:r>
-              <w:rPr>
-                <w:noProof/>
-              </w:rPr>
               <w:instrText xml:space="preserve"> PAGEREF _Toc233093054 \h </w:instrText>
-            </w:r>
-            <w:r>
-              <w:rPr>
-                <w:noProof/>
-              </w:rPr>
-            </w:r>
-            <w:r>
-              <w:rPr>
-                <w:noProof/>
-              </w:rPr>
               <w:fldChar w:fldCharType="separate"/>
-            </w:r>
-            <w:r>
-              <w:rPr>
-                <w:noProof/>
-              </w:rPr>
               <w:t>3</w:t>
-            </w:r>
-            <w:r>
-              <w:rPr>
-                <w:noProof/>
-              </w:rPr>
               <w:fldChar w:fldCharType="end"/>
             </w:r>
           </w:hyperlink>
@@ -545,40 +450,10 @@
                 <w:noProof/>
               </w:rPr>
               <w:tab/>
-            </w:r>
-            <w:r>
-              <w:rPr>
-                <w:noProof/>
-              </w:rPr>
               <w:fldChar w:fldCharType="begin"/>
-            </w:r>
-            <w:r>
-              <w:rPr>
-                <w:noProof/>
-              </w:rPr>
               <w:instrText xml:space="preserve"> PAGEREF _Toc233093055 \h </w:instrText>
-            </w:r>
-            <w:r>
-              <w:rPr>
-                <w:noProof/>
-              </w:rPr>
-            </w:r>
-            <w:r>
-              <w:rPr>
-                <w:noProof/>
-              </w:rPr>
               <w:fldChar w:fldCharType="separate"/>
-            </w:r>
-            <w:r>
-              <w:rPr>
-                <w:noProof/>
-              </w:rPr>
               <w:t>3</w:t>
-            </w:r>
-            <w:r>
-              <w:rPr>
-                <w:noProof/>
-              </w:rPr>
               <w:fldChar w:fldCharType="end"/>
             </w:r>
           </w:hyperlink>
@@ -606,40 +481,10 @@
                 <w:noProof/>
               </w:rPr>
               <w:tab/>
-            </w:r>
-            <w:r>
-              <w:rPr>
-                <w:noProof/>
-              </w:rPr>
               <w:fldChar w:fldCharType="begin"/>
-            </w:r>
-            <w:r>
-              <w:rPr>
-                <w:noProof/>
-              </w:rPr>
               <w:instrText xml:space="preserve"> PAGEREF _Toc233093056 \h </w:instrText>
-            </w:r>
-            <w:r>
-              <w:rPr>
-                <w:noProof/>
-              </w:rPr>
-            </w:r>
-            <w:r>
-              <w:rPr>
-                <w:noProof/>
-              </w:rPr>
               <w:fldChar w:fldCharType="separate"/>
-            </w:r>
-            <w:r>
-              <w:rPr>
-                <w:noProof/>
-              </w:rPr>
               <w:t>4</w:t>
-            </w:r>
-            <w:r>
-              <w:rPr>
-                <w:noProof/>
-              </w:rPr>
               <w:fldChar w:fldCharType="end"/>
             </w:r>
           </w:hyperlink>
@@ -667,40 +512,10 @@
                 <w:noProof/>
               </w:rPr>
               <w:tab/>
-            </w:r>
-            <w:r>
-              <w:rPr>
-                <w:noProof/>
-              </w:rPr>
               <w:fldChar w:fldCharType="begin"/>
-            </w:r>
-            <w:r>
-              <w:rPr>
-                <w:noProof/>
-              </w:rPr>
               <w:instrText xml:space="preserve"> PAGEREF _Toc233093057 \h </w:instrText>
-            </w:r>
-            <w:r>
-              <w:rPr>
-                <w:noProof/>
-              </w:rPr>
-            </w:r>
-            <w:r>
-              <w:rPr>
-                <w:noProof/>
-              </w:rPr>
               <w:fldChar w:fldCharType="separate"/>
-            </w:r>
-            <w:r>
-              <w:rPr>
-                <w:noProof/>
-              </w:rPr>
               <w:t>4</w:t>
-            </w:r>
-            <w:r>
-              <w:rPr>
-                <w:noProof/>
-              </w:rPr>
               <w:fldChar w:fldCharType="end"/>
             </w:r>
           </w:hyperlink>
@@ -721,54 +536,17 @@
                 <w:rStyle w:val="Hyperlink"/>
                 <w:noProof/>
               </w:rPr>
-              <w:t xml:space="preserve">6. </w:t>
-            </w:r>
-            <w:r>
-              <w:rPr>
-                <w:rStyle w:val="Hyperlink"/>
+              <w:t>6. Materiales y recursos</w:t>
+            </w:r>
+            <w:r>
+              <w:rPr>
                 <w:noProof/>
               </w:rPr>
-              <w:t>Materiales y recursos</w:t>
-            </w:r>
-            <w:r>
-              <w:rPr>
-                <w:noProof/>
-              </w:rPr>
               <w:tab/>
-            </w:r>
-            <w:r>
-              <w:rPr>
-                <w:noProof/>
-              </w:rPr>
               <w:fldChar w:fldCharType="begin"/>
-            </w:r>
-            <w:r>
-              <w:rPr>
-                <w:noProof/>
-              </w:rPr>
               <w:instrText xml:space="preserve"> PAGEREF _Toc233093058 \h </w:instrText>
-            </w:r>
-            <w:r>
-              <w:rPr>
-                <w:noProof/>
-              </w:rPr>
-            </w:r>
-            <w:r>
-              <w:rPr>
-                <w:noProof/>
-              </w:rPr>
               <w:fldChar w:fldCharType="separate"/>
-            </w:r>
-            <w:r>
-              <w:rPr>
-                <w:noProof/>
-              </w:rPr>
               <w:t>4</w:t>
-            </w:r>
-            <w:r>
-              <w:rPr>
-                <w:noProof/>
-              </w:rPr>
               <w:fldChar w:fldCharType="end"/>
             </w:r>
           </w:hyperlink>
@@ -804,40 +582,10 @@
                 <w:noProof/>
               </w:rPr>
               <w:tab/>
-            </w:r>
-            <w:r>
-              <w:rPr>
-                <w:noProof/>
-              </w:rPr>
               <w:fldChar w:fldCharType="begin"/>
-            </w:r>
-            <w:r>
-              <w:rPr>
-                <w:noProof/>
-              </w:rPr>
               <w:instrText xml:space="preserve"> PAGEREF _Toc233093059 \h </w:instrText>
-            </w:r>
-            <w:r>
-              <w:rPr>
-                <w:noProof/>
-              </w:rPr>
-            </w:r>
-            <w:r>
-              <w:rPr>
-                <w:noProof/>
-              </w:rPr>
               <w:fldChar w:fldCharType="separate"/>
-            </w:r>
-            <w:r>
-              <w:rPr>
-                <w:noProof/>
-              </w:rPr>
               <w:t>5</w:t>
-            </w:r>
-            <w:r>
-              <w:rPr>
-                <w:noProof/>
-              </w:rPr>
               <w:fldChar w:fldCharType="end"/>
             </w:r>
           </w:hyperlink>
@@ -865,40 +613,10 @@
                 <w:noProof/>
               </w:rPr>
               <w:tab/>
-            </w:r>
-            <w:r>
-              <w:rPr>
-                <w:noProof/>
-              </w:rPr>
               <w:fldChar w:fldCharType="begin"/>
-            </w:r>
-            <w:r>
-              <w:rPr>
-                <w:noProof/>
-              </w:rPr>
               <w:instrText xml:space="preserve"> PAGEREF _Toc233093060 \h </w:instrText>
-            </w:r>
-            <w:r>
-              <w:rPr>
-                <w:noProof/>
-              </w:rPr>
-            </w:r>
-            <w:r>
-              <w:rPr>
-                <w:noProof/>
-              </w:rPr>
               <w:fldChar w:fldCharType="separate"/>
-            </w:r>
-            <w:r>
-              <w:rPr>
-                <w:noProof/>
-              </w:rPr>
               <w:t>5</w:t>
-            </w:r>
-            <w:r>
-              <w:rPr>
-                <w:noProof/>
-              </w:rPr>
               <w:fldChar w:fldCharType="end"/>
             </w:r>
           </w:hyperlink>
@@ -926,40 +644,10 @@
                 <w:noProof/>
               </w:rPr>
               <w:tab/>
-            </w:r>
-            <w:r>
-              <w:rPr>
-                <w:noProof/>
-              </w:rPr>
               <w:fldChar w:fldCharType="begin"/>
-            </w:r>
-            <w:r>
-              <w:rPr>
-                <w:noProof/>
-              </w:rPr>
               <w:instrText xml:space="preserve"> PAGEREF _Toc233093061 \h </w:instrText>
-            </w:r>
-            <w:r>
-              <w:rPr>
-                <w:noProof/>
-              </w:rPr>
-            </w:r>
-            <w:r>
-              <w:rPr>
-                <w:noProof/>
-              </w:rPr>
               <w:fldChar w:fldCharType="separate"/>
-            </w:r>
-            <w:r>
-              <w:rPr>
-                <w:noProof/>
-              </w:rPr>
               <w:t>6</w:t>
-            </w:r>
-            <w:r>
-              <w:rPr>
-                <w:noProof/>
-              </w:rPr>
               <w:fldChar w:fldCharType="end"/>
             </w:r>
           </w:hyperlink>
@@ -987,40 +675,10 @@
                 <w:noProof/>
               </w:rPr>
               <w:tab/>
-            </w:r>
-            <w:r>
-              <w:rPr>
-                <w:noProof/>
-              </w:rPr>
               <w:fldChar w:fldCharType="begin"/>
-            </w:r>
-            <w:r>
-              <w:rPr>
-                <w:noProof/>
-              </w:rPr>
               <w:instrText xml:space="preserve"> PAGEREF _Toc233093062 \h </w:instrText>
-            </w:r>
-            <w:r>
-              <w:rPr>
-                <w:noProof/>
-              </w:rPr>
-            </w:r>
-            <w:r>
-              <w:rPr>
-                <w:noProof/>
-              </w:rPr>
               <w:fldChar w:fldCharType="separate"/>
-            </w:r>
-            <w:r>
-              <w:rPr>
-                <w:noProof/>
-              </w:rPr>
               <w:t>6</w:t>
-            </w:r>
-            <w:r>
-              <w:rPr>
-                <w:noProof/>
-              </w:rPr>
               <w:fldChar w:fldCharType="end"/>
             </w:r>
           </w:hyperlink>
@@ -1048,40 +706,10 @@
                 <w:noProof/>
               </w:rPr>
               <w:tab/>
-            </w:r>
-            <w:r>
-              <w:rPr>
-                <w:noProof/>
-              </w:rPr>
               <w:fldChar w:fldCharType="begin"/>
-            </w:r>
-            <w:r>
-              <w:rPr>
-                <w:noProof/>
-              </w:rPr>
               <w:instrText xml:space="preserve"> PAGEREF _Toc233093063 \h </w:instrText>
-            </w:r>
-            <w:r>
-              <w:rPr>
-                <w:noProof/>
-              </w:rPr>
-            </w:r>
-            <w:r>
-              <w:rPr>
-                <w:noProof/>
-              </w:rPr>
               <w:fldChar w:fldCharType="separate"/>
-            </w:r>
-            <w:r>
-              <w:rPr>
-                <w:noProof/>
-              </w:rPr>
               <w:t>6</w:t>
-            </w:r>
-            <w:r>
-              <w:rPr>
-                <w:noProof/>
-              </w:rPr>
               <w:fldChar w:fldCharType="end"/>
             </w:r>
           </w:hyperlink>
@@ -1109,40 +737,10 @@
                 <w:noProof/>
               </w:rPr>
               <w:tab/>
-            </w:r>
-            <w:r>
-              <w:rPr>
-                <w:noProof/>
-              </w:rPr>
               <w:fldChar w:fldCharType="begin"/>
-            </w:r>
-            <w:r>
-              <w:rPr>
-                <w:noProof/>
-              </w:rPr>
               <w:instrText xml:space="preserve"> PAGEREF _Toc233093064 \h </w:instrText>
-            </w:r>
-            <w:r>
-              <w:rPr>
-                <w:noProof/>
-              </w:rPr>
-            </w:r>
-            <w:r>
-              <w:rPr>
-                <w:noProof/>
-              </w:rPr>
               <w:fldChar w:fldCharType="separate"/>
-            </w:r>
-            <w:r>
-              <w:rPr>
-                <w:noProof/>
-              </w:rPr>
               <w:t>6</w:t>
-            </w:r>
-            <w:r>
-              <w:rPr>
-                <w:noProof/>
-              </w:rPr>
               <w:fldChar w:fldCharType="end"/>
             </w:r>
           </w:hyperlink>
@@ -1202,12 +800,6 @@
         <w:gridCol w:w="6560"/>
       </w:tblGrid>
       <w:tr>
-        <w:tblPrEx>
-          <w:tblCellMar>
-            <w:top w:w="0" w:type="dxa"/>
-            <w:bottom w:w="0" w:type="dxa"/>
-          </w:tblCellMar>
-        </w:tblPrEx>
         <w:tc>
           <w:tcPr>
             <w:tcW w:w="2800" w:type="dxa"/>
@@ -1277,12 +869,6 @@
         </w:tc>
       </w:tr>
       <w:tr>
-        <w:tblPrEx>
-          <w:tblCellMar>
-            <w:top w:w="0" w:type="dxa"/>
-            <w:bottom w:w="0" w:type="dxa"/>
-          </w:tblCellMar>
-        </w:tblPrEx>
         <w:tc>
           <w:tcPr>
             <w:tcW w:w="2800" w:type="dxa"/>
@@ -1352,12 +938,6 @@
         </w:tc>
       </w:tr>
       <w:tr>
-        <w:tblPrEx>
-          <w:tblCellMar>
-            <w:top w:w="0" w:type="dxa"/>
-            <w:bottom w:w="0" w:type="dxa"/>
-          </w:tblCellMar>
-        </w:tblPrEx>
         <w:tc>
           <w:tcPr>
             <w:tcW w:w="2800" w:type="dxa"/>
@@ -1427,12 +1007,6 @@
         </w:tc>
       </w:tr>
       <w:tr>
-        <w:tblPrEx>
-          <w:tblCellMar>
-            <w:top w:w="0" w:type="dxa"/>
-            <w:bottom w:w="0" w:type="dxa"/>
-          </w:tblCellMar>
-        </w:tblPrEx>
         <w:tc>
           <w:tcPr>
             <w:tcW w:w="2800" w:type="dxa"/>
@@ -1502,12 +1076,6 @@
         </w:tc>
       </w:tr>
       <w:tr>
-        <w:tblPrEx>
-          <w:tblCellMar>
-            <w:top w:w="0" w:type="dxa"/>
-            <w:bottom w:w="0" w:type="dxa"/>
-          </w:tblCellMar>
-        </w:tblPrEx>
         <w:tc>
           <w:tcPr>
             <w:tcW w:w="2800" w:type="dxa"/>
@@ -1577,12 +1145,6 @@
         </w:tc>
       </w:tr>
       <w:tr>
-        <w:tblPrEx>
-          <w:tblCellMar>
-            <w:top w:w="0" w:type="dxa"/>
-            <w:bottom w:w="0" w:type="dxa"/>
-          </w:tblCellMar>
-        </w:tblPrEx>
         <w:tc>
           <w:tcPr>
             <w:tcW w:w="2800" w:type="dxa"/>
@@ -1652,12 +1214,6 @@
         </w:tc>
       </w:tr>
       <w:tr>
-        <w:tblPrEx>
-          <w:tblCellMar>
-            <w:top w:w="0" w:type="dxa"/>
-            <w:bottom w:w="0" w:type="dxa"/>
-          </w:tblCellMar>
-        </w:tblPrEx>
         <w:tc>
           <w:tcPr>
             <w:tcW w:w="2800" w:type="dxa"/>
@@ -1727,12 +1283,6 @@
         </w:tc>
       </w:tr>
       <w:tr>
-        <w:tblPrEx>
-          <w:tblCellMar>
-            <w:top w:w="0" w:type="dxa"/>
-            <w:bottom w:w="0" w:type="dxa"/>
-          </w:tblCellMar>
-        </w:tblPrEx>
         <w:tc>
           <w:tcPr>
             <w:tcW w:w="2800" w:type="dxa"/>
@@ -1802,12 +1352,6 @@
         </w:tc>
       </w:tr>
       <w:tr>
-        <w:tblPrEx>
-          <w:tblCellMar>
-            <w:top w:w="0" w:type="dxa"/>
-            <w:bottom w:w="0" w:type="dxa"/>
-          </w:tblCellMar>
-        </w:tblPrEx>
         <w:tc>
           <w:tcPr>
             <w:tcW w:w="2800" w:type="dxa"/>
@@ -1890,12 +1434,6 @@
         </w:tc>
       </w:tr>
       <w:tr>
-        <w:tblPrEx>
-          <w:tblCellMar>
-            <w:top w:w="0" w:type="dxa"/>
-            <w:bottom w:w="0" w:type="dxa"/>
-          </w:tblCellMar>
-        </w:tblPrEx>
         <w:tc>
           <w:tcPr>
             <w:tcW w:w="2800" w:type="dxa"/>
@@ -1959,7 +1497,7 @@
               <w:rPr>
                 <w:rFonts w:ascii="Tahoma" w:hAnsi="Tahoma" w:cs="Tahoma"/>
               </w:rPr>
-              <w:t>7 de julio de 2026 · Horarios: martes / jueves / sábado</w:t>
+              <w:t>8 de julio (mié) o 11 de julio (sáb) de 2026 · Horarios: Mié 20:00 · Sáb 11:00 (Chile) / 17:00 (España)</w:t>
             </w:r>
           </w:p>
         </w:tc>
@@ -2748,12 +2286,6 @@
         <w:gridCol w:w="1809"/>
       </w:tblGrid>
       <w:tr>
-        <w:tblPrEx>
-          <w:tblCellMar>
-            <w:top w:w="0" w:type="dxa"/>
-            <w:bottom w:w="0" w:type="dxa"/>
-          </w:tblCellMar>
-        </w:tblPrEx>
         <w:trPr>
           <w:tblHeader/>
         </w:trPr>
@@ -2934,12 +2466,6 @@
         </w:tc>
       </w:tr>
       <w:tr>
-        <w:tblPrEx>
-          <w:tblCellMar>
-            <w:top w:w="0" w:type="dxa"/>
-            <w:bottom w:w="0" w:type="dxa"/>
-          </w:tblCellMar>
-        </w:tblPrEx>
         <w:tc>
           <w:tcPr>
             <w:tcW w:w="760" w:type="dxa"/>
@@ -3006,8 +2532,181 @@
                 <w:bCs/>
                 <w:color w:val="000000"/>
               </w:rPr>
-              <w:t>한글</w:t>
-            </w:r>
+              <w:t>한글 I</w:t>
+            </w:r>
+          </w:p>
+          <w:p>
+            <w:pPr>
+              <w:spacing w:before="20"/>
+              <w:rPr>
+                <w:rFonts w:ascii="Tahoma" w:hAnsi="Tahoma" w:cs="Tahoma"/>
+              </w:rPr>
+            </w:pPr>
+            <w:r>
+              <w:rPr>
+                <w:rFonts w:ascii="Tahoma" w:hAnsi="Tahoma" w:cs="Tahoma"/>
+              </w:rPr>
+              <w:t>Vocales y sílaba</w:t>
+            </w:r>
+          </w:p>
+        </w:tc>
+        <w:tc>
+          <w:tcPr>
+            <w:tcW w:w="2500" w:type="dxa"/>
+            <w:tcBorders>
+              <w:top w:val="single" w:sz="2" w:space="0" w:color="D9D5F2"/>
+              <w:left w:val="single" w:sz="2" w:space="0" w:color="D9D5F2"/>
+              <w:bottom w:val="single" w:sz="2" w:space="0" w:color="D9D5F2"/>
+              <w:right w:val="single" w:sz="2" w:space="0" w:color="D9D5F2"/>
+            </w:tcBorders>
+            <w:shd w:val="clear" w:color="auto" w:fill="FFFFFF"/>
+            <w:tcMar>
+              <w:top w:w="70" w:type="dxa"/>
+              <w:left w:w="120" w:type="dxa"/>
+              <w:bottom w:w="70" w:type="dxa"/>
+              <w:right w:w="120" w:type="dxa"/>
+            </w:tcMar>
+            <w:vAlign w:val="center"/>
+          </w:tcPr>
+          <w:p>
+            <w:pPr>
+              <w:rPr>
+                <w:rFonts w:ascii="Tahoma" w:hAnsi="Tahoma" w:cs="Tahoma"/>
+              </w:rPr>
+            </w:pPr>
+            <w:r>
+              <w:rPr>
+                <w:rFonts w:ascii="Tahoma" w:hAnsi="Tahoma" w:cs="Tahoma"/>
+              </w:rPr>
+              <w:t>Estructura silábica; vocales básicas y derivadas</w:t>
+            </w:r>
+          </w:p>
+        </w:tc>
+        <w:tc>
+          <w:tcPr>
+            <w:tcW w:w="2700" w:type="dxa"/>
+            <w:tcBorders>
+              <w:top w:val="single" w:sz="2" w:space="0" w:color="D9D5F2"/>
+              <w:left w:val="single" w:sz="2" w:space="0" w:color="D9D5F2"/>
+              <w:bottom w:val="single" w:sz="2" w:space="0" w:color="D9D5F2"/>
+              <w:right w:val="single" w:sz="2" w:space="0" w:color="D9D5F2"/>
+            </w:tcBorders>
+            <w:shd w:val="clear" w:color="auto" w:fill="FFFFFF"/>
+            <w:tcMar>
+              <w:top w:w="70" w:type="dxa"/>
+              <w:left w:w="120" w:type="dxa"/>
+              <w:bottom w:w="70" w:type="dxa"/>
+              <w:right w:w="120" w:type="dxa"/>
+            </w:tcMar>
+            <w:vAlign w:val="center"/>
+          </w:tcPr>
+          <w:p>
+            <w:pPr>
+              <w:rPr>
+                <w:rFonts w:ascii="Tahoma" w:hAnsi="Tahoma" w:cs="Tahoma"/>
+              </w:rPr>
+            </w:pPr>
+            <w:r>
+              <w:rPr>
+                <w:rFonts w:ascii="Tahoma" w:hAnsi="Tahoma" w:cs="Tahoma"/>
+              </w:rPr>
+              <w:t>Vocales; saludos mínimos</w:t>
+            </w:r>
+          </w:p>
+        </w:tc>
+        <w:tc>
+          <w:tcPr>
+            <w:tcW w:w="1900" w:type="dxa"/>
+            <w:tcBorders>
+              <w:top w:val="single" w:sz="2" w:space="0" w:color="D9D5F2"/>
+              <w:left w:val="single" w:sz="2" w:space="0" w:color="D9D5F2"/>
+              <w:bottom w:val="single" w:sz="2" w:space="0" w:color="D9D5F2"/>
+              <w:right w:val="single" w:sz="2" w:space="0" w:color="D9D5F2"/>
+            </w:tcBorders>
+            <w:shd w:val="clear" w:color="auto" w:fill="FFFFFF"/>
+            <w:tcMar>
+              <w:top w:w="70" w:type="dxa"/>
+              <w:left w:w="120" w:type="dxa"/>
+              <w:bottom w:w="70" w:type="dxa"/>
+              <w:right w:w="120" w:type="dxa"/>
+            </w:tcMar>
+            <w:vAlign w:val="center"/>
+          </w:tcPr>
+          <w:p>
+            <w:pPr>
+              <w:rPr>
+                <w:rFonts w:ascii="Tahoma" w:hAnsi="Tahoma" w:cs="Tahoma"/>
+              </w:rPr>
+            </w:pPr>
+            <w:r>
+              <w:rPr>
+                <w:rFonts w:ascii="Tahoma" w:hAnsi="Tahoma" w:cs="Tahoma"/>
+              </w:rPr>
+              <w:t>Leer 20 sílabas en voz alta</w:t>
+            </w:r>
+          </w:p>
+        </w:tc>
+      </w:tr>
+      <w:tr>
+        <w:tc>
+          <w:tcPr>
+            <w:tcW w:w="760" w:type="dxa"/>
+            <w:tcBorders>
+              <w:top w:val="single" w:sz="2" w:space="0" w:color="D9D5F2"/>
+              <w:left w:val="single" w:sz="2" w:space="0" w:color="D9D5F2"/>
+              <w:bottom w:val="single" w:sz="2" w:space="0" w:color="D9D5F2"/>
+              <w:right w:val="single" w:sz="2" w:space="0" w:color="D9D5F2"/>
+            </w:tcBorders>
+            <w:shd w:val="clear" w:color="auto" w:fill="F7F6FE"/>
+            <w:tcMar>
+              <w:top w:w="70" w:type="dxa"/>
+              <w:left w:w="120" w:type="dxa"/>
+              <w:bottom w:w="70" w:type="dxa"/>
+              <w:right w:w="120" w:type="dxa"/>
+            </w:tcMar>
+            <w:vAlign w:val="center"/>
+          </w:tcPr>
+          <w:p>
+            <w:pPr>
+              <w:jc w:val="center"/>
+              <w:rPr>
+                <w:rFonts w:ascii="Tahoma" w:hAnsi="Tahoma" w:cs="Tahoma"/>
+              </w:rPr>
+            </w:pPr>
+            <w:r>
+              <w:rPr>
+                <w:rFonts w:ascii="Tahoma" w:hAnsi="Tahoma" w:cs="Tahoma"/>
+                <w:b/>
+                <w:bCs/>
+                <w:color w:val="3D2EE8"/>
+              </w:rPr>
+              <w:t>02</w:t>
+            </w:r>
+          </w:p>
+        </w:tc>
+        <w:tc>
+          <w:tcPr>
+            <w:tcW w:w="1500" w:type="dxa"/>
+            <w:tcBorders>
+              <w:top w:val="single" w:sz="2" w:space="0" w:color="D9D5F2"/>
+              <w:left w:val="single" w:sz="2" w:space="0" w:color="D9D5F2"/>
+              <w:bottom w:val="single" w:sz="2" w:space="0" w:color="D9D5F2"/>
+              <w:right w:val="single" w:sz="2" w:space="0" w:color="D9D5F2"/>
+            </w:tcBorders>
+            <w:shd w:val="clear" w:color="auto" w:fill="F7F6FE"/>
+            <w:tcMar>
+              <w:top w:w="70" w:type="dxa"/>
+              <w:left w:w="120" w:type="dxa"/>
+              <w:bottom w:w="70" w:type="dxa"/>
+              <w:right w:w="120" w:type="dxa"/>
+            </w:tcMar>
+          </w:tcPr>
+          <w:p>
+            <w:pPr>
+              <w:rPr>
+                <w:rFonts w:ascii="Tahoma" w:hAnsi="Tahoma" w:cs="Tahoma"/>
+              </w:rPr>
+            </w:pPr>
             <w:r>
               <w:rPr>
                 <w:rFonts w:ascii="Tahoma" w:eastAsia="Malgun Gothic" w:hAnsi="Tahoma" w:cs="Tahoma"/>
@@ -3015,7 +2714,7 @@
                 <w:bCs/>
                 <w:color w:val="000000"/>
               </w:rPr>
-              <w:t xml:space="preserve"> I</w:t>
+              <w:t>한글 II</w:t>
             </w:r>
           </w:p>
           <w:p>
@@ -3029,7 +2728,7 @@
               <w:rPr>
                 <w:rFonts w:ascii="Tahoma" w:hAnsi="Tahoma" w:cs="Tahoma"/>
               </w:rPr>
-              <w:t>Vocales y sílaba</w:t>
+              <w:t>Consonantes y batchim</w:t>
             </w:r>
           </w:p>
         </w:tc>
@@ -3042,26 +2741,39 @@
               <w:bottom w:val="single" w:sz="2" w:space="0" w:color="D9D5F2"/>
               <w:right w:val="single" w:sz="2" w:space="0" w:color="D9D5F2"/>
             </w:tcBorders>
-            <w:shd w:val="clear" w:color="auto" w:fill="FFFFFF"/>
-            <w:tcMar>
-              <w:top w:w="70" w:type="dxa"/>
-              <w:left w:w="120" w:type="dxa"/>
-              <w:bottom w:w="70" w:type="dxa"/>
-              <w:right w:w="120" w:type="dxa"/>
-            </w:tcMar>
-            <w:vAlign w:val="center"/>
-          </w:tcPr>
-          <w:p>
-            <w:pPr>
-              <w:rPr>
-                <w:rFonts w:ascii="Tahoma" w:hAnsi="Tahoma" w:cs="Tahoma"/>
-              </w:rPr>
-            </w:pPr>
-            <w:r>
-              <w:rPr>
-                <w:rFonts w:ascii="Tahoma" w:hAnsi="Tahoma" w:cs="Tahoma"/>
-              </w:rPr>
-              <w:t>Estructura silábica; vocales básicas y derivadas</w:t>
+            <w:shd w:val="clear" w:color="auto" w:fill="F7F6FE"/>
+            <w:tcMar>
+              <w:top w:w="70" w:type="dxa"/>
+              <w:left w:w="120" w:type="dxa"/>
+              <w:bottom w:w="70" w:type="dxa"/>
+              <w:right w:w="120" w:type="dxa"/>
+            </w:tcMar>
+            <w:vAlign w:val="center"/>
+          </w:tcPr>
+          <w:p>
+            <w:pPr>
+              <w:rPr>
+                <w:rFonts w:ascii="Tahoma" w:hAnsi="Tahoma" w:cs="Tahoma"/>
+              </w:rPr>
+            </w:pPr>
+            <w:r>
+              <w:rPr>
+                <w:rFonts w:ascii="Tahoma" w:hAnsi="Tahoma" w:cs="Tahoma"/>
+              </w:rPr>
+              <w:t>14 consonantes; consonante final (</w:t>
+            </w:r>
+            <w:r>
+              <w:rPr>
+                <w:rFonts w:ascii="Tahoma" w:eastAsia="Malgun Gothic" w:hAnsi="Tahoma" w:cs="Tahoma"/>
+                <w:color w:val="000000"/>
+              </w:rPr>
+              <w:t>받침</w:t>
+            </w:r>
+            <w:r>
+              <w:rPr>
+                <w:rFonts w:ascii="Tahoma" w:hAnsi="Tahoma" w:cs="Tahoma"/>
+              </w:rPr>
+              <w:t>)</w:t>
             </w:r>
           </w:p>
         </w:tc>
@@ -3074,26 +2786,26 @@
               <w:bottom w:val="single" w:sz="2" w:space="0" w:color="D9D5F2"/>
               <w:right w:val="single" w:sz="2" w:space="0" w:color="D9D5F2"/>
             </w:tcBorders>
-            <w:shd w:val="clear" w:color="auto" w:fill="FFFFFF"/>
-            <w:tcMar>
-              <w:top w:w="70" w:type="dxa"/>
-              <w:left w:w="120" w:type="dxa"/>
-              <w:bottom w:w="70" w:type="dxa"/>
-              <w:right w:w="120" w:type="dxa"/>
-            </w:tcMar>
-            <w:vAlign w:val="center"/>
-          </w:tcPr>
-          <w:p>
-            <w:pPr>
-              <w:rPr>
-                <w:rFonts w:ascii="Tahoma" w:hAnsi="Tahoma" w:cs="Tahoma"/>
-              </w:rPr>
-            </w:pPr>
-            <w:r>
-              <w:rPr>
-                <w:rFonts w:ascii="Tahoma" w:hAnsi="Tahoma" w:cs="Tahoma"/>
-              </w:rPr>
-              <w:t>Vocales; saludos mínimos</w:t>
+            <w:shd w:val="clear" w:color="auto" w:fill="F7F6FE"/>
+            <w:tcMar>
+              <w:top w:w="70" w:type="dxa"/>
+              <w:left w:w="120" w:type="dxa"/>
+              <w:bottom w:w="70" w:type="dxa"/>
+              <w:right w:w="120" w:type="dxa"/>
+            </w:tcMar>
+            <w:vAlign w:val="center"/>
+          </w:tcPr>
+          <w:p>
+            <w:pPr>
+              <w:rPr>
+                <w:rFonts w:ascii="Tahoma" w:hAnsi="Tahoma" w:cs="Tahoma"/>
+              </w:rPr>
+            </w:pPr>
+            <w:r>
+              <w:rPr>
+                <w:rFonts w:ascii="Tahoma" w:hAnsi="Tahoma" w:cs="Tahoma"/>
+              </w:rPr>
+              <w:t>Palabras de 1–2 sílabas</w:t>
             </w:r>
           </w:p>
         </w:tc>
@@ -3106,37 +2818,31 @@
               <w:bottom w:val="single" w:sz="2" w:space="0" w:color="D9D5F2"/>
               <w:right w:val="single" w:sz="2" w:space="0" w:color="D9D5F2"/>
             </w:tcBorders>
-            <w:shd w:val="clear" w:color="auto" w:fill="FFFFFF"/>
-            <w:tcMar>
-              <w:top w:w="70" w:type="dxa"/>
-              <w:left w:w="120" w:type="dxa"/>
-              <w:bottom w:w="70" w:type="dxa"/>
-              <w:right w:w="120" w:type="dxa"/>
-            </w:tcMar>
-            <w:vAlign w:val="center"/>
-          </w:tcPr>
-          <w:p>
-            <w:pPr>
-              <w:rPr>
-                <w:rFonts w:ascii="Tahoma" w:hAnsi="Tahoma" w:cs="Tahoma"/>
-              </w:rPr>
-            </w:pPr>
-            <w:r>
-              <w:rPr>
-                <w:rFonts w:ascii="Tahoma" w:hAnsi="Tahoma" w:cs="Tahoma"/>
-              </w:rPr>
-              <w:t>Leer 20 sílabas en voz alta</w:t>
+            <w:shd w:val="clear" w:color="auto" w:fill="F7F6FE"/>
+            <w:tcMar>
+              <w:top w:w="70" w:type="dxa"/>
+              <w:left w:w="120" w:type="dxa"/>
+              <w:bottom w:w="70" w:type="dxa"/>
+              <w:right w:w="120" w:type="dxa"/>
+            </w:tcMar>
+            <w:vAlign w:val="center"/>
+          </w:tcPr>
+          <w:p>
+            <w:pPr>
+              <w:rPr>
+                <w:rFonts w:ascii="Tahoma" w:hAnsi="Tahoma" w:cs="Tahoma"/>
+              </w:rPr>
+            </w:pPr>
+            <w:r>
+              <w:rPr>
+                <w:rFonts w:ascii="Tahoma" w:hAnsi="Tahoma" w:cs="Tahoma"/>
+              </w:rPr>
+              <w:t>Transcribir 10 palabras</w:t>
             </w:r>
           </w:p>
         </w:tc>
       </w:tr>
       <w:tr>
-        <w:tblPrEx>
-          <w:tblCellMar>
-            <w:top w:w="0" w:type="dxa"/>
-            <w:bottom w:w="0" w:type="dxa"/>
-          </w:tblCellMar>
-        </w:tblPrEx>
         <w:tc>
           <w:tcPr>
             <w:tcW w:w="760" w:type="dxa"/>
@@ -3146,7 +2852,7 @@
               <w:bottom w:val="single" w:sz="2" w:space="0" w:color="D9D5F2"/>
               <w:right w:val="single" w:sz="2" w:space="0" w:color="D9D5F2"/>
             </w:tcBorders>
-            <w:shd w:val="clear" w:color="auto" w:fill="F7F6FE"/>
+            <w:shd w:val="clear" w:color="auto" w:fill="FFFFFF"/>
             <w:tcMar>
               <w:top w:w="70" w:type="dxa"/>
               <w:left w:w="120" w:type="dxa"/>
@@ -3169,7 +2875,7 @@
                 <w:bCs/>
                 <w:color w:val="3D2EE8"/>
               </w:rPr>
-              <w:t>02</w:t>
+              <w:t>03</w:t>
             </w:r>
           </w:p>
         </w:tc>
@@ -3182,7 +2888,7 @@
               <w:bottom w:val="single" w:sz="2" w:space="0" w:color="D9D5F2"/>
               <w:right w:val="single" w:sz="2" w:space="0" w:color="D9D5F2"/>
             </w:tcBorders>
-            <w:shd w:val="clear" w:color="auto" w:fill="F7F6FE"/>
+            <w:shd w:val="clear" w:color="auto" w:fill="FFFFFF"/>
             <w:tcMar>
               <w:top w:w="70" w:type="dxa"/>
               <w:left w:w="120" w:type="dxa"/>
@@ -3203,8 +2909,227 @@
                 <w:bCs/>
                 <w:color w:val="000000"/>
               </w:rPr>
-              <w:t>한글</w:t>
-            </w:r>
+              <w:t>인사</w:t>
+            </w:r>
+          </w:p>
+          <w:p>
+            <w:pPr>
+              <w:spacing w:before="20"/>
+              <w:rPr>
+                <w:rFonts w:ascii="Tahoma" w:hAnsi="Tahoma" w:cs="Tahoma"/>
+              </w:rPr>
+            </w:pPr>
+            <w:r>
+              <w:rPr>
+                <w:rFonts w:ascii="Tahoma" w:hAnsi="Tahoma" w:cs="Tahoma"/>
+              </w:rPr>
+              <w:t>Saludos y presentación</w:t>
+            </w:r>
+          </w:p>
+        </w:tc>
+        <w:tc>
+          <w:tcPr>
+            <w:tcW w:w="2500" w:type="dxa"/>
+            <w:tcBorders>
+              <w:top w:val="single" w:sz="2" w:space="0" w:color="D9D5F2"/>
+              <w:left w:val="single" w:sz="2" w:space="0" w:color="D9D5F2"/>
+              <w:bottom w:val="single" w:sz="2" w:space="0" w:color="D9D5F2"/>
+              <w:right w:val="single" w:sz="2" w:space="0" w:color="D9D5F2"/>
+            </w:tcBorders>
+            <w:shd w:val="clear" w:color="auto" w:fill="FFFFFF"/>
+            <w:tcMar>
+              <w:top w:w="70" w:type="dxa"/>
+              <w:left w:w="120" w:type="dxa"/>
+              <w:bottom w:w="70" w:type="dxa"/>
+              <w:right w:w="120" w:type="dxa"/>
+            </w:tcMar>
+            <w:vAlign w:val="center"/>
+          </w:tcPr>
+          <w:p>
+            <w:pPr>
+              <w:rPr>
+                <w:rFonts w:ascii="Tahoma" w:hAnsi="Tahoma" w:cs="Tahoma"/>
+              </w:rPr>
+            </w:pPr>
+            <w:r>
+              <w:rPr>
+                <w:rFonts w:ascii="Tahoma" w:hAnsi="Tahoma" w:cs="Tahoma"/>
+              </w:rPr>
+              <w:t xml:space="preserve">Partículas </w:t>
+            </w:r>
+            <w:r>
+              <w:rPr>
+                <w:rFonts w:ascii="Tahoma" w:eastAsia="Malgun Gothic" w:hAnsi="Tahoma" w:cs="Tahoma"/>
+                <w:color w:val="000000"/>
+              </w:rPr>
+              <w:t>은</w:t>
+            </w:r>
+            <w:r>
+              <w:rPr>
+                <w:rFonts w:ascii="Tahoma" w:hAnsi="Tahoma" w:cs="Tahoma"/>
+              </w:rPr>
+              <w:t>/</w:t>
+            </w:r>
+            <w:r>
+              <w:rPr>
+                <w:rFonts w:ascii="Tahoma" w:eastAsia="Malgun Gothic" w:hAnsi="Tahoma" w:cs="Tahoma"/>
+                <w:color w:val="000000"/>
+              </w:rPr>
+              <w:t>는</w:t>
+            </w:r>
+            <w:r>
+              <w:rPr>
+                <w:rFonts w:ascii="Tahoma" w:hAnsi="Tahoma" w:cs="Tahoma"/>
+              </w:rPr>
+              <w:t xml:space="preserve">; cópula </w:t>
+            </w:r>
+            <w:r>
+              <w:rPr>
+                <w:rFonts w:ascii="Tahoma" w:eastAsia="Malgun Gothic" w:hAnsi="Tahoma" w:cs="Tahoma"/>
+                <w:color w:val="000000"/>
+              </w:rPr>
+              <w:t>이에요</w:t>
+            </w:r>
+            <w:r>
+              <w:rPr>
+                <w:rFonts w:ascii="Tahoma" w:hAnsi="Tahoma" w:cs="Tahoma"/>
+              </w:rPr>
+              <w:t>/</w:t>
+            </w:r>
+            <w:r>
+              <w:rPr>
+                <w:rFonts w:ascii="Tahoma" w:eastAsia="Malgun Gothic" w:hAnsi="Tahoma" w:cs="Tahoma"/>
+                <w:color w:val="000000"/>
+              </w:rPr>
+              <w:t>예요</w:t>
+            </w:r>
+          </w:p>
+        </w:tc>
+        <w:tc>
+          <w:tcPr>
+            <w:tcW w:w="2700" w:type="dxa"/>
+            <w:tcBorders>
+              <w:top w:val="single" w:sz="2" w:space="0" w:color="D9D5F2"/>
+              <w:left w:val="single" w:sz="2" w:space="0" w:color="D9D5F2"/>
+              <w:bottom w:val="single" w:sz="2" w:space="0" w:color="D9D5F2"/>
+              <w:right w:val="single" w:sz="2" w:space="0" w:color="D9D5F2"/>
+            </w:tcBorders>
+            <w:shd w:val="clear" w:color="auto" w:fill="FFFFFF"/>
+            <w:tcMar>
+              <w:top w:w="70" w:type="dxa"/>
+              <w:left w:w="120" w:type="dxa"/>
+              <w:bottom w:w="70" w:type="dxa"/>
+              <w:right w:w="120" w:type="dxa"/>
+            </w:tcMar>
+            <w:vAlign w:val="center"/>
+          </w:tcPr>
+          <w:p>
+            <w:pPr>
+              <w:rPr>
+                <w:rFonts w:ascii="Tahoma" w:hAnsi="Tahoma" w:cs="Tahoma"/>
+              </w:rPr>
+            </w:pPr>
+            <w:r>
+              <w:rPr>
+                <w:rFonts w:ascii="Tahoma" w:hAnsi="Tahoma" w:cs="Tahoma"/>
+              </w:rPr>
+              <w:t>Países, profesiones, nombres</w:t>
+            </w:r>
+          </w:p>
+        </w:tc>
+        <w:tc>
+          <w:tcPr>
+            <w:tcW w:w="1900" w:type="dxa"/>
+            <w:tcBorders>
+              <w:top w:val="single" w:sz="2" w:space="0" w:color="D9D5F2"/>
+              <w:left w:val="single" w:sz="2" w:space="0" w:color="D9D5F2"/>
+              <w:bottom w:val="single" w:sz="2" w:space="0" w:color="D9D5F2"/>
+              <w:right w:val="single" w:sz="2" w:space="0" w:color="D9D5F2"/>
+            </w:tcBorders>
+            <w:shd w:val="clear" w:color="auto" w:fill="FFFFFF"/>
+            <w:tcMar>
+              <w:top w:w="70" w:type="dxa"/>
+              <w:left w:w="120" w:type="dxa"/>
+              <w:bottom w:w="70" w:type="dxa"/>
+              <w:right w:w="120" w:type="dxa"/>
+            </w:tcMar>
+            <w:vAlign w:val="center"/>
+          </w:tcPr>
+          <w:p>
+            <w:pPr>
+              <w:rPr>
+                <w:rFonts w:ascii="Tahoma" w:hAnsi="Tahoma" w:cs="Tahoma"/>
+              </w:rPr>
+            </w:pPr>
+            <w:r>
+              <w:rPr>
+                <w:rFonts w:ascii="Tahoma" w:hAnsi="Tahoma" w:cs="Tahoma"/>
+              </w:rPr>
+              <w:t>Preséntate en 3 frases</w:t>
+            </w:r>
+          </w:p>
+        </w:tc>
+      </w:tr>
+      <w:tr>
+        <w:tc>
+          <w:tcPr>
+            <w:tcW w:w="760" w:type="dxa"/>
+            <w:tcBorders>
+              <w:top w:val="single" w:sz="2" w:space="0" w:color="D9D5F2"/>
+              <w:left w:val="single" w:sz="2" w:space="0" w:color="D9D5F2"/>
+              <w:bottom w:val="single" w:sz="2" w:space="0" w:color="D9D5F2"/>
+              <w:right w:val="single" w:sz="2" w:space="0" w:color="D9D5F2"/>
+            </w:tcBorders>
+            <w:shd w:val="clear" w:color="auto" w:fill="F7F6FE"/>
+            <w:tcMar>
+              <w:top w:w="70" w:type="dxa"/>
+              <w:left w:w="120" w:type="dxa"/>
+              <w:bottom w:w="70" w:type="dxa"/>
+              <w:right w:w="120" w:type="dxa"/>
+            </w:tcMar>
+            <w:vAlign w:val="center"/>
+          </w:tcPr>
+          <w:p>
+            <w:pPr>
+              <w:jc w:val="center"/>
+              <w:rPr>
+                <w:rFonts w:ascii="Tahoma" w:hAnsi="Tahoma" w:cs="Tahoma"/>
+              </w:rPr>
+            </w:pPr>
+            <w:r>
+              <w:rPr>
+                <w:rFonts w:ascii="Tahoma" w:hAnsi="Tahoma" w:cs="Tahoma"/>
+                <w:b/>
+                <w:bCs/>
+                <w:color w:val="3D2EE8"/>
+              </w:rPr>
+              <w:t>04</w:t>
+            </w:r>
+          </w:p>
+        </w:tc>
+        <w:tc>
+          <w:tcPr>
+            <w:tcW w:w="1500" w:type="dxa"/>
+            <w:tcBorders>
+              <w:top w:val="single" w:sz="2" w:space="0" w:color="D9D5F2"/>
+              <w:left w:val="single" w:sz="2" w:space="0" w:color="D9D5F2"/>
+              <w:bottom w:val="single" w:sz="2" w:space="0" w:color="D9D5F2"/>
+              <w:right w:val="single" w:sz="2" w:space="0" w:color="D9D5F2"/>
+            </w:tcBorders>
+            <w:shd w:val="clear" w:color="auto" w:fill="F7F6FE"/>
+            <w:tcMar>
+              <w:top w:w="70" w:type="dxa"/>
+              <w:left w:w="120" w:type="dxa"/>
+              <w:bottom w:w="70" w:type="dxa"/>
+              <w:right w:w="120" w:type="dxa"/>
+            </w:tcMar>
+          </w:tcPr>
+          <w:p>
+            <w:pPr>
+              <w:rPr>
+                <w:rFonts w:ascii="Tahoma" w:hAnsi="Tahoma" w:cs="Tahoma"/>
+              </w:rPr>
+            </w:pPr>
             <w:r>
               <w:rPr>
                 <w:rFonts w:ascii="Tahoma" w:eastAsia="Malgun Gothic" w:hAnsi="Tahoma" w:cs="Tahoma"/>
@@ -3212,7 +3137,7 @@
                 <w:bCs/>
                 <w:color w:val="000000"/>
               </w:rPr>
-              <w:t xml:space="preserve"> II</w:t>
+              <w:t>일상생활</w:t>
             </w:r>
           </w:p>
           <w:p>
@@ -3226,7 +3151,7 @@
               <w:rPr>
                 <w:rFonts w:ascii="Tahoma" w:hAnsi="Tahoma" w:cs="Tahoma"/>
               </w:rPr>
-              <w:t>Consonantes y batchim</w:t>
+              <w:t>Vida diaria y verbos</w:t>
             </w:r>
           </w:p>
         </w:tc>
@@ -3258,20 +3183,33 @@
               <w:rPr>
                 <w:rFonts w:ascii="Tahoma" w:hAnsi="Tahoma" w:cs="Tahoma"/>
               </w:rPr>
-              <w:t>14 consonantes; consonante final (</w:t>
+              <w:t>Presente -</w:t>
             </w:r>
             <w:r>
               <w:rPr>
                 <w:rFonts w:ascii="Tahoma" w:eastAsia="Malgun Gothic" w:hAnsi="Tahoma" w:cs="Tahoma"/>
                 <w:color w:val="000000"/>
               </w:rPr>
-              <w:t>받침</w:t>
-            </w:r>
-            <w:r>
-              <w:rPr>
-                <w:rFonts w:ascii="Tahoma" w:hAnsi="Tahoma" w:cs="Tahoma"/>
-              </w:rPr>
-              <w:t>)</w:t>
+              <w:t>아요</w:t>
+            </w:r>
+            <w:r>
+              <w:rPr>
+                <w:rFonts w:ascii="Tahoma" w:hAnsi="Tahoma" w:cs="Tahoma"/>
+              </w:rPr>
+              <w:t>/</w:t>
+            </w:r>
+            <w:r>
+              <w:rPr>
+                <w:rFonts w:ascii="Tahoma" w:eastAsia="Malgun Gothic" w:hAnsi="Tahoma" w:cs="Tahoma"/>
+                <w:color w:val="000000"/>
+              </w:rPr>
+              <w:t>어요</w:t>
+            </w:r>
+            <w:r>
+              <w:rPr>
+                <w:rFonts w:ascii="Tahoma" w:hAnsi="Tahoma" w:cs="Tahoma"/>
+              </w:rPr>
+              <w:t>; 20 verbos esenciales</w:t>
             </w:r>
           </w:p>
         </w:tc>
@@ -3303,7 +3241,7 @@
               <w:rPr>
                 <w:rFonts w:ascii="Tahoma" w:hAnsi="Tahoma" w:cs="Tahoma"/>
               </w:rPr>
-              <w:t>Palabras de 1–2 sílabas</w:t>
+              <w:t>Acciones cotidianas</w:t>
             </w:r>
           </w:p>
         </w:tc>
@@ -3335,18 +3273,12 @@
               <w:rPr>
                 <w:rFonts w:ascii="Tahoma" w:hAnsi="Tahoma" w:cs="Tahoma"/>
               </w:rPr>
-              <w:t>Transcribir 10 palabras</w:t>
+              <w:t>Describe tu día (5 frases)</w:t>
             </w:r>
           </w:p>
         </w:tc>
       </w:tr>
       <w:tr>
-        <w:tblPrEx>
-          <w:tblCellMar>
-            <w:top w:w="0" w:type="dxa"/>
-            <w:bottom w:w="0" w:type="dxa"/>
-          </w:tblCellMar>
-        </w:tblPrEx>
         <w:tc>
           <w:tcPr>
             <w:tcW w:w="760" w:type="dxa"/>
@@ -3379,7 +3311,7 @@
                 <w:bCs/>
                 <w:color w:val="3D2EE8"/>
               </w:rPr>
-              <w:t>03</w:t>
+              <w:t>05</w:t>
             </w:r>
           </w:p>
         </w:tc>
@@ -3413,7 +3345,7 @@
                 <w:bCs/>
                 <w:color w:val="000000"/>
               </w:rPr>
-              <w:t>인사</w:t>
+              <w:t>날짜와 숫자</w:t>
             </w:r>
           </w:p>
           <w:p>
@@ -3427,7 +3359,7 @@
               <w:rPr>
                 <w:rFonts w:ascii="Tahoma" w:hAnsi="Tahoma" w:cs="Tahoma"/>
               </w:rPr>
-              <w:t>Saludos y presentación</w:t>
+              <w:t>Fechas, días y números</w:t>
             </w:r>
           </w:p>
         </w:tc>
@@ -3459,53 +3391,14 @@
               <w:rPr>
                 <w:rFonts w:ascii="Tahoma" w:hAnsi="Tahoma" w:cs="Tahoma"/>
               </w:rPr>
-              <w:t xml:space="preserve">Partículas </w:t>
+              <w:t xml:space="preserve">Números sino-coreanos y nativos; </w:t>
             </w:r>
             <w:r>
               <w:rPr>
                 <w:rFonts w:ascii="Tahoma" w:eastAsia="Malgun Gothic" w:hAnsi="Tahoma" w:cs="Tahoma"/>
                 <w:color w:val="000000"/>
               </w:rPr>
-              <w:t>은</w:t>
-            </w:r>
-            <w:r>
-              <w:rPr>
-                <w:rFonts w:ascii="Tahoma" w:hAnsi="Tahoma" w:cs="Tahoma"/>
-              </w:rPr>
-              <w:t>/</w:t>
-            </w:r>
-            <w:r>
-              <w:rPr>
-                <w:rFonts w:ascii="Tahoma" w:eastAsia="Malgun Gothic" w:hAnsi="Tahoma" w:cs="Tahoma"/>
-                <w:color w:val="000000"/>
-              </w:rPr>
-              <w:t>는</w:t>
-            </w:r>
-            <w:r>
-              <w:rPr>
-                <w:rFonts w:ascii="Tahoma" w:hAnsi="Tahoma" w:cs="Tahoma"/>
-              </w:rPr>
-              <w:t xml:space="preserve">; cópula </w:t>
-            </w:r>
-            <w:r>
-              <w:rPr>
-                <w:rFonts w:ascii="Tahoma" w:eastAsia="Malgun Gothic" w:hAnsi="Tahoma" w:cs="Tahoma"/>
-                <w:color w:val="000000"/>
-              </w:rPr>
-              <w:t>이에요</w:t>
-            </w:r>
-            <w:r>
-              <w:rPr>
-                <w:rFonts w:ascii="Tahoma" w:hAnsi="Tahoma" w:cs="Tahoma"/>
-              </w:rPr>
-              <w:t>/</w:t>
-            </w:r>
-            <w:r>
-              <w:rPr>
-                <w:rFonts w:ascii="Tahoma" w:eastAsia="Malgun Gothic" w:hAnsi="Tahoma" w:cs="Tahoma"/>
-                <w:color w:val="000000"/>
-              </w:rPr>
-              <w:t>예요</w:t>
+              <w:t>요일</w:t>
             </w:r>
           </w:p>
         </w:tc>
@@ -3537,7 +3430,7 @@
               <w:rPr>
                 <w:rFonts w:ascii="Tahoma" w:hAnsi="Tahoma" w:cs="Tahoma"/>
               </w:rPr>
-              <w:t>Países, profesiones, nombres</w:t>
+              <w:t>Días, meses, números</w:t>
             </w:r>
           </w:p>
         </w:tc>
@@ -3569,18 +3462,12 @@
               <w:rPr>
                 <w:rFonts w:ascii="Tahoma" w:hAnsi="Tahoma" w:cs="Tahoma"/>
               </w:rPr>
-              <w:t>Preséntate en 3 frases</w:t>
+              <w:t>Escribe 5 fechas y horas</w:t>
             </w:r>
           </w:p>
         </w:tc>
       </w:tr>
       <w:tr>
-        <w:tblPrEx>
-          <w:tblCellMar>
-            <w:top w:w="0" w:type="dxa"/>
-            <w:bottom w:w="0" w:type="dxa"/>
-          </w:tblCellMar>
-        </w:tblPrEx>
         <w:tc>
           <w:tcPr>
             <w:tcW w:w="760" w:type="dxa"/>
@@ -3613,7 +3500,7 @@
                 <w:bCs/>
                 <w:color w:val="3D2EE8"/>
               </w:rPr>
-              <w:t>04</w:t>
+              <w:t>06</w:t>
             </w:r>
           </w:p>
         </w:tc>
@@ -3647,7 +3534,7 @@
                 <w:bCs/>
                 <w:color w:val="000000"/>
               </w:rPr>
-              <w:t>일상생활</w:t>
+              <w:t>위치</w:t>
             </w:r>
           </w:p>
           <w:p>
@@ -3661,7 +3548,7 @@
               <w:rPr>
                 <w:rFonts w:ascii="Tahoma" w:hAnsi="Tahoma" w:cs="Tahoma"/>
               </w:rPr>
-              <w:t>Vida diaria y verbos</w:t>
+              <w:t>Ubicación y existencia</w:t>
             </w:r>
           </w:p>
         </w:tc>
@@ -3689,18 +3576,12 @@
                 <w:rFonts w:ascii="Tahoma" w:hAnsi="Tahoma" w:cs="Tahoma"/>
               </w:rPr>
             </w:pPr>
-            <w:r>
-              <w:rPr>
-                <w:rFonts w:ascii="Tahoma" w:hAnsi="Tahoma" w:cs="Tahoma"/>
-              </w:rPr>
-              <w:t>Presente -</w:t>
-            </w:r>
             <w:r>
               <w:rPr>
                 <w:rFonts w:ascii="Tahoma" w:eastAsia="Malgun Gothic" w:hAnsi="Tahoma" w:cs="Tahoma"/>
                 <w:color w:val="000000"/>
               </w:rPr>
-              <w:t>아요</w:t>
+              <w:t>있다</w:t>
             </w:r>
             <w:r>
               <w:rPr>
@@ -3713,13 +3594,33 @@
                 <w:rFonts w:ascii="Tahoma" w:eastAsia="Malgun Gothic" w:hAnsi="Tahoma" w:cs="Tahoma"/>
                 <w:color w:val="000000"/>
               </w:rPr>
-              <w:t>어요</w:t>
-            </w:r>
-            <w:r>
-              <w:rPr>
-                <w:rFonts w:ascii="Tahoma" w:hAnsi="Tahoma" w:cs="Tahoma"/>
-              </w:rPr>
-              <w:t>; 20 verbos esenciales</w:t>
+              <w:t>없다</w:t>
+            </w:r>
+            <w:r>
+              <w:rPr>
+                <w:rFonts w:ascii="Tahoma" w:hAnsi="Tahoma" w:cs="Tahoma"/>
+              </w:rPr>
+              <w:t xml:space="preserve">; partículas </w:t>
+            </w:r>
+            <w:r>
+              <w:rPr>
+                <w:rFonts w:ascii="Tahoma" w:eastAsia="Malgun Gothic" w:hAnsi="Tahoma" w:cs="Tahoma"/>
+                <w:color w:val="000000"/>
+              </w:rPr>
+              <w:t>에</w:t>
+            </w:r>
+            <w:r>
+              <w:rPr>
+                <w:rFonts w:ascii="Tahoma" w:hAnsi="Tahoma" w:cs="Tahoma"/>
+              </w:rPr>
+              <w:t xml:space="preserve"> / </w:t>
+            </w:r>
+            <w:r>
+              <w:rPr>
+                <w:rFonts w:ascii="Tahoma" w:eastAsia="Malgun Gothic" w:hAnsi="Tahoma" w:cs="Tahoma"/>
+                <w:color w:val="000000"/>
+              </w:rPr>
+              <w:t>에서</w:t>
             </w:r>
           </w:p>
         </w:tc>
@@ -3751,7 +3652,7 @@
               <w:rPr>
                 <w:rFonts w:ascii="Tahoma" w:hAnsi="Tahoma" w:cs="Tahoma"/>
               </w:rPr>
-              <w:t>Acciones cotidianas</w:t>
+              <w:t>Lugares, posiciones</w:t>
             </w:r>
           </w:p>
         </w:tc>
@@ -3783,18 +3684,12 @@
               <w:rPr>
                 <w:rFonts w:ascii="Tahoma" w:hAnsi="Tahoma" w:cs="Tahoma"/>
               </w:rPr>
-              <w:t>Describe tu día (5 frases)</w:t>
+              <w:t>Describe tu habitación</w:t>
             </w:r>
           </w:p>
         </w:tc>
       </w:tr>
       <w:tr>
-        <w:tblPrEx>
-          <w:tblCellMar>
-            <w:top w:w="0" w:type="dxa"/>
-            <w:bottom w:w="0" w:type="dxa"/>
-          </w:tblCellMar>
-        </w:tblPrEx>
         <w:tc>
           <w:tcPr>
             <w:tcW w:w="760" w:type="dxa"/>
@@ -3827,7 +3722,7 @@
                 <w:bCs/>
                 <w:color w:val="3D2EE8"/>
               </w:rPr>
-              <w:t>05</w:t>
+              <w:t>07</w:t>
             </w:r>
           </w:p>
         </w:tc>
@@ -3861,8 +3756,227 @@
                 <w:bCs/>
                 <w:color w:val="000000"/>
               </w:rPr>
-              <w:t>날짜와</w:t>
-            </w:r>
+              <w:t>하루 일과</w:t>
+            </w:r>
+          </w:p>
+          <w:p>
+            <w:pPr>
+              <w:spacing w:before="20"/>
+              <w:rPr>
+                <w:rFonts w:ascii="Tahoma" w:hAnsi="Tahoma" w:cs="Tahoma"/>
+              </w:rPr>
+            </w:pPr>
+            <w:r>
+              <w:rPr>
+                <w:rFonts w:ascii="Tahoma" w:hAnsi="Tahoma" w:cs="Tahoma"/>
+              </w:rPr>
+              <w:t>Rutina diaria</w:t>
+            </w:r>
+          </w:p>
+        </w:tc>
+        <w:tc>
+          <w:tcPr>
+            <w:tcW w:w="2500" w:type="dxa"/>
+            <w:tcBorders>
+              <w:top w:val="single" w:sz="2" w:space="0" w:color="D9D5F2"/>
+              <w:left w:val="single" w:sz="2" w:space="0" w:color="D9D5F2"/>
+              <w:bottom w:val="single" w:sz="2" w:space="0" w:color="D9D5F2"/>
+              <w:right w:val="single" w:sz="2" w:space="0" w:color="D9D5F2"/>
+            </w:tcBorders>
+            <w:shd w:val="clear" w:color="auto" w:fill="FFFFFF"/>
+            <w:tcMar>
+              <w:top w:w="70" w:type="dxa"/>
+              <w:left w:w="120" w:type="dxa"/>
+              <w:bottom w:w="70" w:type="dxa"/>
+              <w:right w:w="120" w:type="dxa"/>
+            </w:tcMar>
+            <w:vAlign w:val="center"/>
+          </w:tcPr>
+          <w:p>
+            <w:pPr>
+              <w:rPr>
+                <w:rFonts w:ascii="Tahoma" w:hAnsi="Tahoma" w:cs="Tahoma"/>
+              </w:rPr>
+            </w:pPr>
+            <w:r>
+              <w:rPr>
+                <w:rFonts w:ascii="Tahoma" w:hAnsi="Tahoma" w:cs="Tahoma"/>
+              </w:rPr>
+              <w:t>La hora; -</w:t>
+            </w:r>
+            <w:r>
+              <w:rPr>
+                <w:rFonts w:ascii="Tahoma" w:eastAsia="Malgun Gothic" w:hAnsi="Tahoma" w:cs="Tahoma"/>
+                <w:color w:val="000000"/>
+              </w:rPr>
+              <w:t>고</w:t>
+            </w:r>
+            <w:r>
+              <w:rPr>
+                <w:rFonts w:ascii="Tahoma" w:hAnsi="Tahoma" w:cs="Tahoma"/>
+              </w:rPr>
+              <w:t xml:space="preserve">; </w:t>
+            </w:r>
+            <w:r>
+              <w:rPr>
+                <w:rFonts w:ascii="Tahoma" w:eastAsia="Malgun Gothic" w:hAnsi="Tahoma" w:cs="Tahoma"/>
+                <w:color w:val="000000"/>
+              </w:rPr>
+              <w:t>부터</w:t>
+            </w:r>
+            <w:r>
+              <w:rPr>
+                <w:rFonts w:ascii="Tahoma" w:hAnsi="Tahoma" w:cs="Tahoma"/>
+              </w:rPr>
+              <w:t>…</w:t>
+            </w:r>
+            <w:r>
+              <w:rPr>
+                <w:rFonts w:ascii="Tahoma" w:eastAsia="Malgun Gothic" w:hAnsi="Tahoma" w:cs="Tahoma"/>
+                <w:color w:val="000000"/>
+              </w:rPr>
+              <w:t>까지</w:t>
+            </w:r>
+            <w:r>
+              <w:rPr>
+                <w:rFonts w:ascii="Tahoma" w:hAnsi="Tahoma" w:cs="Tahoma"/>
+              </w:rPr>
+              <w:t xml:space="preserve">; irregular </w:t>
+            </w:r>
+            <w:r>
+              <w:rPr>
+                <w:rFonts w:ascii="Tahoma" w:eastAsia="Malgun Gothic" w:hAnsi="Tahoma" w:cs="Tahoma"/>
+                <w:color w:val="000000"/>
+              </w:rPr>
+              <w:t>ㄷ</w:t>
+            </w:r>
+          </w:p>
+        </w:tc>
+        <w:tc>
+          <w:tcPr>
+            <w:tcW w:w="2700" w:type="dxa"/>
+            <w:tcBorders>
+              <w:top w:val="single" w:sz="2" w:space="0" w:color="D9D5F2"/>
+              <w:left w:val="single" w:sz="2" w:space="0" w:color="D9D5F2"/>
+              <w:bottom w:val="single" w:sz="2" w:space="0" w:color="D9D5F2"/>
+              <w:right w:val="single" w:sz="2" w:space="0" w:color="D9D5F2"/>
+            </w:tcBorders>
+            <w:shd w:val="clear" w:color="auto" w:fill="FFFFFF"/>
+            <w:tcMar>
+              <w:top w:w="70" w:type="dxa"/>
+              <w:left w:w="120" w:type="dxa"/>
+              <w:bottom w:w="70" w:type="dxa"/>
+              <w:right w:w="120" w:type="dxa"/>
+            </w:tcMar>
+            <w:vAlign w:val="center"/>
+          </w:tcPr>
+          <w:p>
+            <w:pPr>
+              <w:rPr>
+                <w:rFonts w:ascii="Tahoma" w:hAnsi="Tahoma" w:cs="Tahoma"/>
+              </w:rPr>
+            </w:pPr>
+            <w:r>
+              <w:rPr>
+                <w:rFonts w:ascii="Tahoma" w:hAnsi="Tahoma" w:cs="Tahoma"/>
+              </w:rPr>
+              <w:t>Horarios, rutina</w:t>
+            </w:r>
+          </w:p>
+        </w:tc>
+        <w:tc>
+          <w:tcPr>
+            <w:tcW w:w="1900" w:type="dxa"/>
+            <w:tcBorders>
+              <w:top w:val="single" w:sz="2" w:space="0" w:color="D9D5F2"/>
+              <w:left w:val="single" w:sz="2" w:space="0" w:color="D9D5F2"/>
+              <w:bottom w:val="single" w:sz="2" w:space="0" w:color="D9D5F2"/>
+              <w:right w:val="single" w:sz="2" w:space="0" w:color="D9D5F2"/>
+            </w:tcBorders>
+            <w:shd w:val="clear" w:color="auto" w:fill="FFFFFF"/>
+            <w:tcMar>
+              <w:top w:w="70" w:type="dxa"/>
+              <w:left w:w="120" w:type="dxa"/>
+              <w:bottom w:w="70" w:type="dxa"/>
+              <w:right w:w="120" w:type="dxa"/>
+            </w:tcMar>
+            <w:vAlign w:val="center"/>
+          </w:tcPr>
+          <w:p>
+            <w:pPr>
+              <w:rPr>
+                <w:rFonts w:ascii="Tahoma" w:hAnsi="Tahoma" w:cs="Tahoma"/>
+              </w:rPr>
+            </w:pPr>
+            <w:r>
+              <w:rPr>
+                <w:rFonts w:ascii="Tahoma" w:hAnsi="Tahoma" w:cs="Tahoma"/>
+              </w:rPr>
+              <w:t>Tu horario semanal</w:t>
+            </w:r>
+          </w:p>
+        </w:tc>
+      </w:tr>
+      <w:tr>
+        <w:tc>
+          <w:tcPr>
+            <w:tcW w:w="760" w:type="dxa"/>
+            <w:tcBorders>
+              <w:top w:val="single" w:sz="2" w:space="0" w:color="D9D5F2"/>
+              <w:left w:val="single" w:sz="2" w:space="0" w:color="D9D5F2"/>
+              <w:bottom w:val="single" w:sz="2" w:space="0" w:color="D9D5F2"/>
+              <w:right w:val="single" w:sz="2" w:space="0" w:color="D9D5F2"/>
+            </w:tcBorders>
+            <w:shd w:val="clear" w:color="auto" w:fill="F7F6FE"/>
+            <w:tcMar>
+              <w:top w:w="70" w:type="dxa"/>
+              <w:left w:w="120" w:type="dxa"/>
+              <w:bottom w:w="70" w:type="dxa"/>
+              <w:right w:w="120" w:type="dxa"/>
+            </w:tcMar>
+            <w:vAlign w:val="center"/>
+          </w:tcPr>
+          <w:p>
+            <w:pPr>
+              <w:jc w:val="center"/>
+              <w:rPr>
+                <w:rFonts w:ascii="Tahoma" w:hAnsi="Tahoma" w:cs="Tahoma"/>
+              </w:rPr>
+            </w:pPr>
+            <w:r>
+              <w:rPr>
+                <w:rFonts w:ascii="Tahoma" w:hAnsi="Tahoma" w:cs="Tahoma"/>
+                <w:b/>
+                <w:bCs/>
+                <w:color w:val="3D2EE8"/>
+              </w:rPr>
+              <w:t>08</w:t>
+            </w:r>
+          </w:p>
+        </w:tc>
+        <w:tc>
+          <w:tcPr>
+            <w:tcW w:w="1500" w:type="dxa"/>
+            <w:tcBorders>
+              <w:top w:val="single" w:sz="2" w:space="0" w:color="D9D5F2"/>
+              <w:left w:val="single" w:sz="2" w:space="0" w:color="D9D5F2"/>
+              <w:bottom w:val="single" w:sz="2" w:space="0" w:color="D9D5F2"/>
+              <w:right w:val="single" w:sz="2" w:space="0" w:color="D9D5F2"/>
+            </w:tcBorders>
+            <w:shd w:val="clear" w:color="auto" w:fill="F7F6FE"/>
+            <w:tcMar>
+              <w:top w:w="70" w:type="dxa"/>
+              <w:left w:w="120" w:type="dxa"/>
+              <w:bottom w:w="70" w:type="dxa"/>
+              <w:right w:w="120" w:type="dxa"/>
+            </w:tcMar>
+          </w:tcPr>
+          <w:p>
+            <w:pPr>
+              <w:rPr>
+                <w:rFonts w:ascii="Tahoma" w:hAnsi="Tahoma" w:cs="Tahoma"/>
+              </w:rPr>
+            </w:pPr>
             <w:r>
               <w:rPr>
                 <w:rFonts w:ascii="Tahoma" w:eastAsia="Malgun Gothic" w:hAnsi="Tahoma" w:cs="Tahoma"/>
@@ -3870,8 +3984,188 @@
                 <w:bCs/>
                 <w:color w:val="000000"/>
               </w:rPr>
-              <w:t xml:space="preserve"> </w:t>
-            </w:r>
+              <w:t>물건 사기</w:t>
+            </w:r>
+          </w:p>
+          <w:p>
+            <w:pPr>
+              <w:spacing w:before="20"/>
+              <w:rPr>
+                <w:rFonts w:ascii="Tahoma" w:hAnsi="Tahoma" w:cs="Tahoma"/>
+              </w:rPr>
+            </w:pPr>
+            <w:r>
+              <w:rPr>
+                <w:rFonts w:ascii="Tahoma" w:hAnsi="Tahoma" w:cs="Tahoma"/>
+              </w:rPr>
+              <w:t>Comprar en Corea</w:t>
+            </w:r>
+          </w:p>
+        </w:tc>
+        <w:tc>
+          <w:tcPr>
+            <w:tcW w:w="2500" w:type="dxa"/>
+            <w:tcBorders>
+              <w:top w:val="single" w:sz="2" w:space="0" w:color="D9D5F2"/>
+              <w:left w:val="single" w:sz="2" w:space="0" w:color="D9D5F2"/>
+              <w:bottom w:val="single" w:sz="2" w:space="0" w:color="D9D5F2"/>
+              <w:right w:val="single" w:sz="2" w:space="0" w:color="D9D5F2"/>
+            </w:tcBorders>
+            <w:shd w:val="clear" w:color="auto" w:fill="F7F6FE"/>
+            <w:tcMar>
+              <w:top w:w="70" w:type="dxa"/>
+              <w:left w:w="120" w:type="dxa"/>
+              <w:bottom w:w="70" w:type="dxa"/>
+              <w:right w:w="120" w:type="dxa"/>
+            </w:tcMar>
+            <w:vAlign w:val="center"/>
+          </w:tcPr>
+          <w:p>
+            <w:pPr>
+              <w:rPr>
+                <w:rFonts w:ascii="Tahoma" w:hAnsi="Tahoma" w:cs="Tahoma"/>
+              </w:rPr>
+            </w:pPr>
+            <w:r>
+              <w:rPr>
+                <w:rFonts w:ascii="Tahoma" w:hAnsi="Tahoma" w:cs="Tahoma"/>
+              </w:rPr>
+              <w:t xml:space="preserve">Clasificadores/contadores; </w:t>
+            </w:r>
+            <w:r>
+              <w:rPr>
+                <w:rFonts w:ascii="Tahoma" w:eastAsia="Malgun Gothic" w:hAnsi="Tahoma" w:cs="Tahoma"/>
+                <w:color w:val="000000"/>
+              </w:rPr>
+              <w:t>주세요</w:t>
+            </w:r>
+          </w:p>
+        </w:tc>
+        <w:tc>
+          <w:tcPr>
+            <w:tcW w:w="2700" w:type="dxa"/>
+            <w:tcBorders>
+              <w:top w:val="single" w:sz="2" w:space="0" w:color="D9D5F2"/>
+              <w:left w:val="single" w:sz="2" w:space="0" w:color="D9D5F2"/>
+              <w:bottom w:val="single" w:sz="2" w:space="0" w:color="D9D5F2"/>
+              <w:right w:val="single" w:sz="2" w:space="0" w:color="D9D5F2"/>
+            </w:tcBorders>
+            <w:shd w:val="clear" w:color="auto" w:fill="F7F6FE"/>
+            <w:tcMar>
+              <w:top w:w="70" w:type="dxa"/>
+              <w:left w:w="120" w:type="dxa"/>
+              <w:bottom w:w="70" w:type="dxa"/>
+              <w:right w:w="120" w:type="dxa"/>
+            </w:tcMar>
+            <w:vAlign w:val="center"/>
+          </w:tcPr>
+          <w:p>
+            <w:pPr>
+              <w:rPr>
+                <w:rFonts w:ascii="Tahoma" w:hAnsi="Tahoma" w:cs="Tahoma"/>
+              </w:rPr>
+            </w:pPr>
+            <w:r>
+              <w:rPr>
+                <w:rFonts w:ascii="Tahoma" w:hAnsi="Tahoma" w:cs="Tahoma"/>
+              </w:rPr>
+              <w:t>Comida, compras, dinero</w:t>
+            </w:r>
+          </w:p>
+        </w:tc>
+        <w:tc>
+          <w:tcPr>
+            <w:tcW w:w="1900" w:type="dxa"/>
+            <w:tcBorders>
+              <w:top w:val="single" w:sz="2" w:space="0" w:color="D9D5F2"/>
+              <w:left w:val="single" w:sz="2" w:space="0" w:color="D9D5F2"/>
+              <w:bottom w:val="single" w:sz="2" w:space="0" w:color="D9D5F2"/>
+              <w:right w:val="single" w:sz="2" w:space="0" w:color="D9D5F2"/>
+            </w:tcBorders>
+            <w:shd w:val="clear" w:color="auto" w:fill="F7F6FE"/>
+            <w:tcMar>
+              <w:top w:w="70" w:type="dxa"/>
+              <w:left w:w="120" w:type="dxa"/>
+              <w:bottom w:w="70" w:type="dxa"/>
+              <w:right w:w="120" w:type="dxa"/>
+            </w:tcMar>
+            <w:vAlign w:val="center"/>
+          </w:tcPr>
+          <w:p>
+            <w:pPr>
+              <w:rPr>
+                <w:rFonts w:ascii="Tahoma" w:hAnsi="Tahoma" w:cs="Tahoma"/>
+              </w:rPr>
+            </w:pPr>
+            <w:r>
+              <w:rPr>
+                <w:rFonts w:ascii="Tahoma" w:hAnsi="Tahoma" w:cs="Tahoma"/>
+              </w:rPr>
+              <w:t>Diálogo de compra</w:t>
+            </w:r>
+          </w:p>
+        </w:tc>
+      </w:tr>
+      <w:tr>
+        <w:tc>
+          <w:tcPr>
+            <w:tcW w:w="760" w:type="dxa"/>
+            <w:tcBorders>
+              <w:top w:val="single" w:sz="2" w:space="0" w:color="D9D5F2"/>
+              <w:left w:val="single" w:sz="2" w:space="0" w:color="D9D5F2"/>
+              <w:bottom w:val="single" w:sz="2" w:space="0" w:color="D9D5F2"/>
+              <w:right w:val="single" w:sz="2" w:space="0" w:color="D9D5F2"/>
+            </w:tcBorders>
+            <w:shd w:val="clear" w:color="auto" w:fill="FFFFFF"/>
+            <w:tcMar>
+              <w:top w:w="70" w:type="dxa"/>
+              <w:left w:w="120" w:type="dxa"/>
+              <w:bottom w:w="70" w:type="dxa"/>
+              <w:right w:w="120" w:type="dxa"/>
+            </w:tcMar>
+            <w:vAlign w:val="center"/>
+          </w:tcPr>
+          <w:p>
+            <w:pPr>
+              <w:jc w:val="center"/>
+              <w:rPr>
+                <w:rFonts w:ascii="Tahoma" w:hAnsi="Tahoma" w:cs="Tahoma"/>
+              </w:rPr>
+            </w:pPr>
+            <w:r>
+              <w:rPr>
+                <w:rFonts w:ascii="Tahoma" w:hAnsi="Tahoma" w:cs="Tahoma"/>
+                <w:b/>
+                <w:bCs/>
+                <w:color w:val="3D2EE8"/>
+              </w:rPr>
+              <w:t>09</w:t>
+            </w:r>
+          </w:p>
+        </w:tc>
+        <w:tc>
+          <w:tcPr>
+            <w:tcW w:w="1500" w:type="dxa"/>
+            <w:tcBorders>
+              <w:top w:val="single" w:sz="2" w:space="0" w:color="D9D5F2"/>
+              <w:left w:val="single" w:sz="2" w:space="0" w:color="D9D5F2"/>
+              <w:bottom w:val="single" w:sz="2" w:space="0" w:color="D9D5F2"/>
+              <w:right w:val="single" w:sz="2" w:space="0" w:color="D9D5F2"/>
+            </w:tcBorders>
+            <w:shd w:val="clear" w:color="auto" w:fill="FFFFFF"/>
+            <w:tcMar>
+              <w:top w:w="70" w:type="dxa"/>
+              <w:left w:w="120" w:type="dxa"/>
+              <w:bottom w:w="70" w:type="dxa"/>
+              <w:right w:w="120" w:type="dxa"/>
+            </w:tcMar>
+          </w:tcPr>
+          <w:p>
+            <w:pPr>
+              <w:rPr>
+                <w:rFonts w:ascii="Tahoma" w:hAnsi="Tahoma" w:cs="Tahoma"/>
+              </w:rPr>
+            </w:pPr>
             <w:r>
               <w:rPr>
                 <w:rFonts w:ascii="Tahoma" w:eastAsia="Malgun Gothic" w:hAnsi="Tahoma" w:cs="Tahoma"/>
@@ -3879,7 +4173,7 @@
                 <w:bCs/>
                 <w:color w:val="000000"/>
               </w:rPr>
-              <w:t>숫자</w:t>
+              <w:t>주말</w:t>
             </w:r>
           </w:p>
           <w:p>
@@ -3893,7 +4187,7 @@
               <w:rPr>
                 <w:rFonts w:ascii="Tahoma" w:hAnsi="Tahoma" w:cs="Tahoma"/>
               </w:rPr>
-              <w:t>Fechas, días y números</w:t>
+              <w:t>Hablar del pasado</w:t>
             </w:r>
           </w:p>
         </w:tc>
@@ -3925,14 +4219,27 @@
               <w:rPr>
                 <w:rFonts w:ascii="Tahoma" w:hAnsi="Tahoma" w:cs="Tahoma"/>
               </w:rPr>
-              <w:t xml:space="preserve">Números sino-coreanos y nativos; </w:t>
+              <w:t>Pasado -</w:t>
             </w:r>
             <w:r>
               <w:rPr>
                 <w:rFonts w:ascii="Tahoma" w:eastAsia="Malgun Gothic" w:hAnsi="Tahoma" w:cs="Tahoma"/>
                 <w:color w:val="000000"/>
               </w:rPr>
-              <w:t>요일</w:t>
+              <w:t>았어요</w:t>
+            </w:r>
+            <w:r>
+              <w:rPr>
+                <w:rFonts w:ascii="Tahoma" w:hAnsi="Tahoma" w:cs="Tahoma"/>
+              </w:rPr>
+              <w:t>/</w:t>
+            </w:r>
+            <w:r>
+              <w:rPr>
+                <w:rFonts w:ascii="Tahoma" w:eastAsia="Malgun Gothic" w:hAnsi="Tahoma" w:cs="Tahoma"/>
+                <w:color w:val="000000"/>
+              </w:rPr>
+              <w:t>었어요</w:t>
             </w:r>
           </w:p>
         </w:tc>
@@ -3964,7 +4271,7 @@
               <w:rPr>
                 <w:rFonts w:ascii="Tahoma" w:hAnsi="Tahoma" w:cs="Tahoma"/>
               </w:rPr>
-              <w:t>Días, meses, números</w:t>
+              <w:t>Tiempo libre, frecuencia</w:t>
             </w:r>
           </w:p>
         </w:tc>
@@ -3996,18 +4303,12 @@
               <w:rPr>
                 <w:rFonts w:ascii="Tahoma" w:hAnsi="Tahoma" w:cs="Tahoma"/>
               </w:rPr>
-              <w:t>Escribe 5 fechas y horas</w:t>
+              <w:t>Cuenta tu fin de semana</w:t>
             </w:r>
           </w:p>
         </w:tc>
       </w:tr>
       <w:tr>
-        <w:tblPrEx>
-          <w:tblCellMar>
-            <w:top w:w="0" w:type="dxa"/>
-            <w:bottom w:w="0" w:type="dxa"/>
-          </w:tblCellMar>
-        </w:tblPrEx>
         <w:tc>
           <w:tcPr>
             <w:tcW w:w="760" w:type="dxa"/>
@@ -4040,7 +4341,7 @@
                 <w:bCs/>
                 <w:color w:val="3D2EE8"/>
               </w:rPr>
-              <w:t>06</w:t>
+              <w:t>10</w:t>
             </w:r>
           </w:p>
         </w:tc>
@@ -4074,7 +4375,7 @@
                 <w:bCs/>
                 <w:color w:val="000000"/>
               </w:rPr>
-              <w:t>위치</w:t>
+              <w:t>휴가</w:t>
             </w:r>
           </w:p>
           <w:p>
@@ -4088,7 +4389,7 @@
               <w:rPr>
                 <w:rFonts w:ascii="Tahoma" w:hAnsi="Tahoma" w:cs="Tahoma"/>
               </w:rPr>
-              <w:t>Ubicación y existencia</w:t>
+              <w:t>Futuro y deseos</w:t>
             </w:r>
           </w:p>
         </w:tc>
@@ -4116,51 +4417,83 @@
                 <w:rFonts w:ascii="Tahoma" w:hAnsi="Tahoma" w:cs="Tahoma"/>
               </w:rPr>
             </w:pPr>
+            <w:r>
+              <w:rPr>
+                <w:rFonts w:ascii="Tahoma" w:hAnsi="Tahoma" w:cs="Tahoma"/>
+              </w:rPr>
+              <w:t>-(</w:t>
+            </w:r>
             <w:r>
               <w:rPr>
                 <w:rFonts w:ascii="Tahoma" w:eastAsia="Malgun Gothic" w:hAnsi="Tahoma" w:cs="Tahoma"/>
                 <w:color w:val="000000"/>
               </w:rPr>
-              <w:t>있다</w:t>
-            </w:r>
-            <w:r>
-              <w:rPr>
-                <w:rFonts w:ascii="Tahoma" w:hAnsi="Tahoma" w:cs="Tahoma"/>
-              </w:rPr>
-              <w:t>/</w:t>
+              <w:t>으</w:t>
+            </w:r>
+            <w:r>
+              <w:rPr>
+                <w:rFonts w:ascii="Tahoma" w:hAnsi="Tahoma" w:cs="Tahoma"/>
+              </w:rPr>
+              <w:t>)</w:t>
             </w:r>
             <w:r>
               <w:rPr>
                 <w:rFonts w:ascii="Tahoma" w:eastAsia="Malgun Gothic" w:hAnsi="Tahoma" w:cs="Tahoma"/>
                 <w:color w:val="000000"/>
               </w:rPr>
-              <w:t>없다</w:t>
-            </w:r>
-            <w:r>
-              <w:rPr>
-                <w:rFonts w:ascii="Tahoma" w:hAnsi="Tahoma" w:cs="Tahoma"/>
-              </w:rPr>
-              <w:t xml:space="preserve">; partículas </w:t>
+              <w:t>ㄹ</w:t>
+            </w:r>
+            <w:r>
+              <w:rPr>
+                <w:rFonts w:ascii="Tahoma" w:hAnsi="Tahoma" w:cs="Tahoma"/>
+              </w:rPr>
+              <w:t xml:space="preserve"> </w:t>
             </w:r>
             <w:r>
               <w:rPr>
                 <w:rFonts w:ascii="Tahoma" w:eastAsia="Malgun Gothic" w:hAnsi="Tahoma" w:cs="Tahoma"/>
                 <w:color w:val="000000"/>
               </w:rPr>
-              <w:t>에</w:t>
-            </w:r>
-            <w:r>
-              <w:rPr>
-                <w:rFonts w:ascii="Tahoma" w:hAnsi="Tahoma" w:cs="Tahoma"/>
-              </w:rPr>
-              <w:t xml:space="preserve"> / </w:t>
+              <w:t>거예요</w:t>
+            </w:r>
+            <w:r>
+              <w:rPr>
+                <w:rFonts w:ascii="Tahoma" w:hAnsi="Tahoma" w:cs="Tahoma"/>
+              </w:rPr>
+              <w:t>; -</w:t>
             </w:r>
             <w:r>
               <w:rPr>
                 <w:rFonts w:ascii="Tahoma" w:eastAsia="Malgun Gothic" w:hAnsi="Tahoma" w:cs="Tahoma"/>
                 <w:color w:val="000000"/>
               </w:rPr>
-              <w:t>에서</w:t>
+              <w:t>고</w:t>
+            </w:r>
+            <w:r>
+              <w:rPr>
+                <w:rFonts w:ascii="Tahoma" w:hAnsi="Tahoma" w:cs="Tahoma"/>
+              </w:rPr>
+              <w:t xml:space="preserve"> </w:t>
+            </w:r>
+            <w:r>
+              <w:rPr>
+                <w:rFonts w:ascii="Tahoma" w:eastAsia="Malgun Gothic" w:hAnsi="Tahoma" w:cs="Tahoma"/>
+                <w:color w:val="000000"/>
+              </w:rPr>
+              <w:t>싶다</w:t>
+            </w:r>
+            <w:r>
+              <w:rPr>
+                <w:rFonts w:ascii="Tahoma" w:hAnsi="Tahoma" w:cs="Tahoma"/>
+              </w:rPr>
+              <w:t xml:space="preserve">; irregular </w:t>
+            </w:r>
+            <w:r>
+              <w:rPr>
+                <w:rFonts w:ascii="Tahoma" w:eastAsia="Malgun Gothic" w:hAnsi="Tahoma" w:cs="Tahoma"/>
+                <w:color w:val="000000"/>
+              </w:rPr>
+              <w:t>ㅂ</w:t>
             </w:r>
           </w:p>
         </w:tc>
@@ -4192,7 +4525,7 @@
               <w:rPr>
                 <w:rFonts w:ascii="Tahoma" w:hAnsi="Tahoma" w:cs="Tahoma"/>
               </w:rPr>
-              <w:t>Lugares, posiciones</w:t>
+              <w:t>Viajes, planes</w:t>
             </w:r>
           </w:p>
         </w:tc>
@@ -4224,951 +4557,12 @@
               <w:rPr>
                 <w:rFonts w:ascii="Tahoma" w:hAnsi="Tahoma" w:cs="Tahoma"/>
               </w:rPr>
-              <w:t>Describe tu habitación</w:t>
+              <w:t>Planea tus vacaciones</w:t>
             </w:r>
           </w:p>
         </w:tc>
       </w:tr>
       <w:tr>
-        <w:tblPrEx>
-          <w:tblCellMar>
-            <w:top w:w="0" w:type="dxa"/>
-            <w:bottom w:w="0" w:type="dxa"/>
-          </w:tblCellMar>
-        </w:tblPrEx>
-        <w:tc>
-          <w:tcPr>
-            <w:tcW w:w="760" w:type="dxa"/>
-            <w:tcBorders>
-              <w:top w:val="single" w:sz="2" w:space="0" w:color="D9D5F2"/>
-              <w:left w:val="single" w:sz="2" w:space="0" w:color="D9D5F2"/>
-              <w:bottom w:val="single" w:sz="2" w:space="0" w:color="D9D5F2"/>
-              <w:right w:val="single" w:sz="2" w:space="0" w:color="D9D5F2"/>
-            </w:tcBorders>
-            <w:shd w:val="clear" w:color="auto" w:fill="FFFFFF"/>
-            <w:tcMar>
-              <w:top w:w="70" w:type="dxa"/>
-              <w:left w:w="120" w:type="dxa"/>
-              <w:bottom w:w="70" w:type="dxa"/>
-              <w:right w:w="120" w:type="dxa"/>
-            </w:tcMar>
-            <w:vAlign w:val="center"/>
-          </w:tcPr>
-          <w:p>
-            <w:pPr>
-              <w:jc w:val="center"/>
-              <w:rPr>
-                <w:rFonts w:ascii="Tahoma" w:hAnsi="Tahoma" w:cs="Tahoma"/>
-              </w:rPr>
-            </w:pPr>
-            <w:r>
-              <w:rPr>
-                <w:rFonts w:ascii="Tahoma" w:hAnsi="Tahoma" w:cs="Tahoma"/>
-                <w:b/>
-                <w:bCs/>
-                <w:color w:val="3D2EE8"/>
-              </w:rPr>
-              <w:t>07</w:t>
-            </w:r>
-          </w:p>
-        </w:tc>
-        <w:tc>
-          <w:tcPr>
-            <w:tcW w:w="1500" w:type="dxa"/>
-            <w:tcBorders>
-              <w:top w:val="single" w:sz="2" w:space="0" w:color="D9D5F2"/>
-              <w:left w:val="single" w:sz="2" w:space="0" w:color="D9D5F2"/>
-              <w:bottom w:val="single" w:sz="2" w:space="0" w:color="D9D5F2"/>
-              <w:right w:val="single" w:sz="2" w:space="0" w:color="D9D5F2"/>
-            </w:tcBorders>
-            <w:shd w:val="clear" w:color="auto" w:fill="FFFFFF"/>
-            <w:tcMar>
-              <w:top w:w="70" w:type="dxa"/>
-              <w:left w:w="120" w:type="dxa"/>
-              <w:bottom w:w="70" w:type="dxa"/>
-              <w:right w:w="120" w:type="dxa"/>
-            </w:tcMar>
-          </w:tcPr>
-          <w:p>
-            <w:pPr>
-              <w:rPr>
-                <w:rFonts w:ascii="Tahoma" w:hAnsi="Tahoma" w:cs="Tahoma"/>
-              </w:rPr>
-            </w:pPr>
-            <w:r>
-              <w:rPr>
-                <w:rFonts w:ascii="Tahoma" w:eastAsia="Malgun Gothic" w:hAnsi="Tahoma" w:cs="Tahoma"/>
-                <w:b/>
-                <w:bCs/>
-                <w:color w:val="000000"/>
-              </w:rPr>
-              <w:t>하루</w:t>
-            </w:r>
-            <w:r>
-              <w:rPr>
-                <w:rFonts w:ascii="Tahoma" w:eastAsia="Malgun Gothic" w:hAnsi="Tahoma" w:cs="Tahoma"/>
-                <w:b/>
-                <w:bCs/>
-                <w:color w:val="000000"/>
-              </w:rPr>
-              <w:t xml:space="preserve"> </w:t>
-            </w:r>
-            <w:r>
-              <w:rPr>
-                <w:rFonts w:ascii="Tahoma" w:eastAsia="Malgun Gothic" w:hAnsi="Tahoma" w:cs="Tahoma"/>
-                <w:b/>
-                <w:bCs/>
-                <w:color w:val="000000"/>
-              </w:rPr>
-              <w:t>일과</w:t>
-            </w:r>
-          </w:p>
-          <w:p>
-            <w:pPr>
-              <w:spacing w:before="20"/>
-              <w:rPr>
-                <w:rFonts w:ascii="Tahoma" w:hAnsi="Tahoma" w:cs="Tahoma"/>
-              </w:rPr>
-            </w:pPr>
-            <w:r>
-              <w:rPr>
-                <w:rFonts w:ascii="Tahoma" w:hAnsi="Tahoma" w:cs="Tahoma"/>
-              </w:rPr>
-              <w:t>Rutina diaria</w:t>
-            </w:r>
-          </w:p>
-        </w:tc>
-        <w:tc>
-          <w:tcPr>
-            <w:tcW w:w="2500" w:type="dxa"/>
-            <w:tcBorders>
-              <w:top w:val="single" w:sz="2" w:space="0" w:color="D9D5F2"/>
-              <w:left w:val="single" w:sz="2" w:space="0" w:color="D9D5F2"/>
-              <w:bottom w:val="single" w:sz="2" w:space="0" w:color="D9D5F2"/>
-              <w:right w:val="single" w:sz="2" w:space="0" w:color="D9D5F2"/>
-            </w:tcBorders>
-            <w:shd w:val="clear" w:color="auto" w:fill="FFFFFF"/>
-            <w:tcMar>
-              <w:top w:w="70" w:type="dxa"/>
-              <w:left w:w="120" w:type="dxa"/>
-              <w:bottom w:w="70" w:type="dxa"/>
-              <w:right w:w="120" w:type="dxa"/>
-            </w:tcMar>
-            <w:vAlign w:val="center"/>
-          </w:tcPr>
-          <w:p>
-            <w:pPr>
-              <w:rPr>
-                <w:rFonts w:ascii="Tahoma" w:hAnsi="Tahoma" w:cs="Tahoma"/>
-              </w:rPr>
-            </w:pPr>
-            <w:r>
-              <w:rPr>
-                <w:rFonts w:ascii="Tahoma" w:hAnsi="Tahoma" w:cs="Tahoma"/>
-              </w:rPr>
-              <w:t>La hora; -</w:t>
-            </w:r>
-            <w:r>
-              <w:rPr>
-                <w:rFonts w:ascii="Tahoma" w:eastAsia="Malgun Gothic" w:hAnsi="Tahoma" w:cs="Tahoma"/>
-                <w:color w:val="000000"/>
-              </w:rPr>
-              <w:t>고</w:t>
-            </w:r>
-            <w:r>
-              <w:rPr>
-                <w:rFonts w:ascii="Tahoma" w:hAnsi="Tahoma" w:cs="Tahoma"/>
-              </w:rPr>
-              <w:t xml:space="preserve">; </w:t>
-            </w:r>
-            <w:r>
-              <w:rPr>
-                <w:rFonts w:ascii="Tahoma" w:eastAsia="Malgun Gothic" w:hAnsi="Tahoma" w:cs="Tahoma"/>
-                <w:color w:val="000000"/>
-              </w:rPr>
-              <w:t>부터</w:t>
-            </w:r>
-            <w:r>
-              <w:rPr>
-                <w:rFonts w:ascii="Tahoma" w:hAnsi="Tahoma" w:cs="Tahoma"/>
-              </w:rPr>
-              <w:t>…</w:t>
-            </w:r>
-            <w:r>
-              <w:rPr>
-                <w:rFonts w:ascii="Tahoma" w:eastAsia="Malgun Gothic" w:hAnsi="Tahoma" w:cs="Tahoma"/>
-                <w:color w:val="000000"/>
-              </w:rPr>
-              <w:t>까지</w:t>
-            </w:r>
-            <w:r>
-              <w:rPr>
-                <w:rFonts w:ascii="Tahoma" w:hAnsi="Tahoma" w:cs="Tahoma"/>
-              </w:rPr>
-              <w:t xml:space="preserve">; irregular </w:t>
-            </w:r>
-            <w:r>
-              <w:rPr>
-                <w:rFonts w:ascii="Tahoma" w:eastAsia="Malgun Gothic" w:hAnsi="Tahoma" w:cs="Tahoma"/>
-                <w:color w:val="000000"/>
-              </w:rPr>
-              <w:t>ㄷ</w:t>
-            </w:r>
-          </w:p>
-        </w:tc>
-        <w:tc>
-          <w:tcPr>
-            <w:tcW w:w="2700" w:type="dxa"/>
-            <w:tcBorders>
-              <w:top w:val="single" w:sz="2" w:space="0" w:color="D9D5F2"/>
-              <w:left w:val="single" w:sz="2" w:space="0" w:color="D9D5F2"/>
-              <w:bottom w:val="single" w:sz="2" w:space="0" w:color="D9D5F2"/>
-              <w:right w:val="single" w:sz="2" w:space="0" w:color="D9D5F2"/>
-            </w:tcBorders>
-            <w:shd w:val="clear" w:color="auto" w:fill="FFFFFF"/>
-            <w:tcMar>
-              <w:top w:w="70" w:type="dxa"/>
-              <w:left w:w="120" w:type="dxa"/>
-              <w:bottom w:w="70" w:type="dxa"/>
-              <w:right w:w="120" w:type="dxa"/>
-            </w:tcMar>
-            <w:vAlign w:val="center"/>
-          </w:tcPr>
-          <w:p>
-            <w:pPr>
-              <w:rPr>
-                <w:rFonts w:ascii="Tahoma" w:hAnsi="Tahoma" w:cs="Tahoma"/>
-              </w:rPr>
-            </w:pPr>
-            <w:r>
-              <w:rPr>
-                <w:rFonts w:ascii="Tahoma" w:hAnsi="Tahoma" w:cs="Tahoma"/>
-              </w:rPr>
-              <w:t>Horarios, rutina</w:t>
-            </w:r>
-          </w:p>
-        </w:tc>
-        <w:tc>
-          <w:tcPr>
-            <w:tcW w:w="1900" w:type="dxa"/>
-            <w:tcBorders>
-              <w:top w:val="single" w:sz="2" w:space="0" w:color="D9D5F2"/>
-              <w:left w:val="single" w:sz="2" w:space="0" w:color="D9D5F2"/>
-              <w:bottom w:val="single" w:sz="2" w:space="0" w:color="D9D5F2"/>
-              <w:right w:val="single" w:sz="2" w:space="0" w:color="D9D5F2"/>
-            </w:tcBorders>
-            <w:shd w:val="clear" w:color="auto" w:fill="FFFFFF"/>
-            <w:tcMar>
-              <w:top w:w="70" w:type="dxa"/>
-              <w:left w:w="120" w:type="dxa"/>
-              <w:bottom w:w="70" w:type="dxa"/>
-              <w:right w:w="120" w:type="dxa"/>
-            </w:tcMar>
-            <w:vAlign w:val="center"/>
-          </w:tcPr>
-          <w:p>
-            <w:pPr>
-              <w:rPr>
-                <w:rFonts w:ascii="Tahoma" w:hAnsi="Tahoma" w:cs="Tahoma"/>
-              </w:rPr>
-            </w:pPr>
-            <w:r>
-              <w:rPr>
-                <w:rFonts w:ascii="Tahoma" w:hAnsi="Tahoma" w:cs="Tahoma"/>
-              </w:rPr>
-              <w:t>Tu horario semanal</w:t>
-            </w:r>
-          </w:p>
-        </w:tc>
-      </w:tr>
-      <w:tr>
-        <w:tblPrEx>
-          <w:tblCellMar>
-            <w:top w:w="0" w:type="dxa"/>
-            <w:bottom w:w="0" w:type="dxa"/>
-          </w:tblCellMar>
-        </w:tblPrEx>
-        <w:tc>
-          <w:tcPr>
-            <w:tcW w:w="760" w:type="dxa"/>
-            <w:tcBorders>
-              <w:top w:val="single" w:sz="2" w:space="0" w:color="D9D5F2"/>
-              <w:left w:val="single" w:sz="2" w:space="0" w:color="D9D5F2"/>
-              <w:bottom w:val="single" w:sz="2" w:space="0" w:color="D9D5F2"/>
-              <w:right w:val="single" w:sz="2" w:space="0" w:color="D9D5F2"/>
-            </w:tcBorders>
-            <w:shd w:val="clear" w:color="auto" w:fill="F7F6FE"/>
-            <w:tcMar>
-              <w:top w:w="70" w:type="dxa"/>
-              <w:left w:w="120" w:type="dxa"/>
-              <w:bottom w:w="70" w:type="dxa"/>
-              <w:right w:w="120" w:type="dxa"/>
-            </w:tcMar>
-            <w:vAlign w:val="center"/>
-          </w:tcPr>
-          <w:p>
-            <w:pPr>
-              <w:jc w:val="center"/>
-              <w:rPr>
-                <w:rFonts w:ascii="Tahoma" w:hAnsi="Tahoma" w:cs="Tahoma"/>
-              </w:rPr>
-            </w:pPr>
-            <w:r>
-              <w:rPr>
-                <w:rFonts w:ascii="Tahoma" w:hAnsi="Tahoma" w:cs="Tahoma"/>
-                <w:b/>
-                <w:bCs/>
-                <w:color w:val="3D2EE8"/>
-              </w:rPr>
-              <w:t>08</w:t>
-            </w:r>
-          </w:p>
-        </w:tc>
-        <w:tc>
-          <w:tcPr>
-            <w:tcW w:w="1500" w:type="dxa"/>
-            <w:tcBorders>
-              <w:top w:val="single" w:sz="2" w:space="0" w:color="D9D5F2"/>
-              <w:left w:val="single" w:sz="2" w:space="0" w:color="D9D5F2"/>
-              <w:bottom w:val="single" w:sz="2" w:space="0" w:color="D9D5F2"/>
-              <w:right w:val="single" w:sz="2" w:space="0" w:color="D9D5F2"/>
-            </w:tcBorders>
-            <w:shd w:val="clear" w:color="auto" w:fill="F7F6FE"/>
-            <w:tcMar>
-              <w:top w:w="70" w:type="dxa"/>
-              <w:left w:w="120" w:type="dxa"/>
-              <w:bottom w:w="70" w:type="dxa"/>
-              <w:right w:w="120" w:type="dxa"/>
-            </w:tcMar>
-          </w:tcPr>
-          <w:p>
-            <w:pPr>
-              <w:rPr>
-                <w:rFonts w:ascii="Tahoma" w:hAnsi="Tahoma" w:cs="Tahoma"/>
-              </w:rPr>
-            </w:pPr>
-            <w:r>
-              <w:rPr>
-                <w:rFonts w:ascii="Tahoma" w:eastAsia="Malgun Gothic" w:hAnsi="Tahoma" w:cs="Tahoma"/>
-                <w:b/>
-                <w:bCs/>
-                <w:color w:val="000000"/>
-              </w:rPr>
-              <w:t>물건</w:t>
-            </w:r>
-            <w:r>
-              <w:rPr>
-                <w:rFonts w:ascii="Tahoma" w:eastAsia="Malgun Gothic" w:hAnsi="Tahoma" w:cs="Tahoma"/>
-                <w:b/>
-                <w:bCs/>
-                <w:color w:val="000000"/>
-              </w:rPr>
-              <w:t xml:space="preserve"> </w:t>
-            </w:r>
-            <w:r>
-              <w:rPr>
-                <w:rFonts w:ascii="Tahoma" w:eastAsia="Malgun Gothic" w:hAnsi="Tahoma" w:cs="Tahoma"/>
-                <w:b/>
-                <w:bCs/>
-                <w:color w:val="000000"/>
-              </w:rPr>
-              <w:t>사기</w:t>
-            </w:r>
-          </w:p>
-          <w:p>
-            <w:pPr>
-              <w:spacing w:before="20"/>
-              <w:rPr>
-                <w:rFonts w:ascii="Tahoma" w:hAnsi="Tahoma" w:cs="Tahoma"/>
-              </w:rPr>
-            </w:pPr>
-            <w:r>
-              <w:rPr>
-                <w:rFonts w:ascii="Tahoma" w:hAnsi="Tahoma" w:cs="Tahoma"/>
-              </w:rPr>
-              <w:t>Comprar en Corea</w:t>
-            </w:r>
-          </w:p>
-        </w:tc>
-        <w:tc>
-          <w:tcPr>
-            <w:tcW w:w="2500" w:type="dxa"/>
-            <w:tcBorders>
-              <w:top w:val="single" w:sz="2" w:space="0" w:color="D9D5F2"/>
-              <w:left w:val="single" w:sz="2" w:space="0" w:color="D9D5F2"/>
-              <w:bottom w:val="single" w:sz="2" w:space="0" w:color="D9D5F2"/>
-              <w:right w:val="single" w:sz="2" w:space="0" w:color="D9D5F2"/>
-            </w:tcBorders>
-            <w:shd w:val="clear" w:color="auto" w:fill="F7F6FE"/>
-            <w:tcMar>
-              <w:top w:w="70" w:type="dxa"/>
-              <w:left w:w="120" w:type="dxa"/>
-              <w:bottom w:w="70" w:type="dxa"/>
-              <w:right w:w="120" w:type="dxa"/>
-            </w:tcMar>
-            <w:vAlign w:val="center"/>
-          </w:tcPr>
-          <w:p>
-            <w:pPr>
-              <w:rPr>
-                <w:rFonts w:ascii="Tahoma" w:hAnsi="Tahoma" w:cs="Tahoma"/>
-              </w:rPr>
-            </w:pPr>
-            <w:r>
-              <w:rPr>
-                <w:rFonts w:ascii="Tahoma" w:hAnsi="Tahoma" w:cs="Tahoma"/>
-              </w:rPr>
-              <w:t xml:space="preserve">Clasificadores/contadores; </w:t>
-            </w:r>
-            <w:r>
-              <w:rPr>
-                <w:rFonts w:ascii="Tahoma" w:eastAsia="Malgun Gothic" w:hAnsi="Tahoma" w:cs="Tahoma"/>
-                <w:color w:val="000000"/>
-              </w:rPr>
-              <w:t>주세요</w:t>
-            </w:r>
-          </w:p>
-        </w:tc>
-        <w:tc>
-          <w:tcPr>
-            <w:tcW w:w="2700" w:type="dxa"/>
-            <w:tcBorders>
-              <w:top w:val="single" w:sz="2" w:space="0" w:color="D9D5F2"/>
-              <w:left w:val="single" w:sz="2" w:space="0" w:color="D9D5F2"/>
-              <w:bottom w:val="single" w:sz="2" w:space="0" w:color="D9D5F2"/>
-              <w:right w:val="single" w:sz="2" w:space="0" w:color="D9D5F2"/>
-            </w:tcBorders>
-            <w:shd w:val="clear" w:color="auto" w:fill="F7F6FE"/>
-            <w:tcMar>
-              <w:top w:w="70" w:type="dxa"/>
-              <w:left w:w="120" w:type="dxa"/>
-              <w:bottom w:w="70" w:type="dxa"/>
-              <w:right w:w="120" w:type="dxa"/>
-            </w:tcMar>
-            <w:vAlign w:val="center"/>
-          </w:tcPr>
-          <w:p>
-            <w:pPr>
-              <w:rPr>
-                <w:rFonts w:ascii="Tahoma" w:hAnsi="Tahoma" w:cs="Tahoma"/>
-              </w:rPr>
-            </w:pPr>
-            <w:r>
-              <w:rPr>
-                <w:rFonts w:ascii="Tahoma" w:hAnsi="Tahoma" w:cs="Tahoma"/>
-              </w:rPr>
-              <w:t>Comida, compras, dinero</w:t>
-            </w:r>
-          </w:p>
-        </w:tc>
-        <w:tc>
-          <w:tcPr>
-            <w:tcW w:w="1900" w:type="dxa"/>
-            <w:tcBorders>
-              <w:top w:val="single" w:sz="2" w:space="0" w:color="D9D5F2"/>
-              <w:left w:val="single" w:sz="2" w:space="0" w:color="D9D5F2"/>
-              <w:bottom w:val="single" w:sz="2" w:space="0" w:color="D9D5F2"/>
-              <w:right w:val="single" w:sz="2" w:space="0" w:color="D9D5F2"/>
-            </w:tcBorders>
-            <w:shd w:val="clear" w:color="auto" w:fill="F7F6FE"/>
-            <w:tcMar>
-              <w:top w:w="70" w:type="dxa"/>
-              <w:left w:w="120" w:type="dxa"/>
-              <w:bottom w:w="70" w:type="dxa"/>
-              <w:right w:w="120" w:type="dxa"/>
-            </w:tcMar>
-            <w:vAlign w:val="center"/>
-          </w:tcPr>
-          <w:p>
-            <w:pPr>
-              <w:rPr>
-                <w:rFonts w:ascii="Tahoma" w:hAnsi="Tahoma" w:cs="Tahoma"/>
-              </w:rPr>
-            </w:pPr>
-            <w:r>
-              <w:rPr>
-                <w:rFonts w:ascii="Tahoma" w:hAnsi="Tahoma" w:cs="Tahoma"/>
-              </w:rPr>
-              <w:t>Diálogo de compra</w:t>
-            </w:r>
-          </w:p>
-        </w:tc>
-      </w:tr>
-      <w:tr>
-        <w:tblPrEx>
-          <w:tblCellMar>
-            <w:top w:w="0" w:type="dxa"/>
-            <w:bottom w:w="0" w:type="dxa"/>
-          </w:tblCellMar>
-        </w:tblPrEx>
-        <w:tc>
-          <w:tcPr>
-            <w:tcW w:w="760" w:type="dxa"/>
-            <w:tcBorders>
-              <w:top w:val="single" w:sz="2" w:space="0" w:color="D9D5F2"/>
-              <w:left w:val="single" w:sz="2" w:space="0" w:color="D9D5F2"/>
-              <w:bottom w:val="single" w:sz="2" w:space="0" w:color="D9D5F2"/>
-              <w:right w:val="single" w:sz="2" w:space="0" w:color="D9D5F2"/>
-            </w:tcBorders>
-            <w:shd w:val="clear" w:color="auto" w:fill="FFFFFF"/>
-            <w:tcMar>
-              <w:top w:w="70" w:type="dxa"/>
-              <w:left w:w="120" w:type="dxa"/>
-              <w:bottom w:w="70" w:type="dxa"/>
-              <w:right w:w="120" w:type="dxa"/>
-            </w:tcMar>
-            <w:vAlign w:val="center"/>
-          </w:tcPr>
-          <w:p>
-            <w:pPr>
-              <w:jc w:val="center"/>
-              <w:rPr>
-                <w:rFonts w:ascii="Tahoma" w:hAnsi="Tahoma" w:cs="Tahoma"/>
-              </w:rPr>
-            </w:pPr>
-            <w:r>
-              <w:rPr>
-                <w:rFonts w:ascii="Tahoma" w:hAnsi="Tahoma" w:cs="Tahoma"/>
-                <w:b/>
-                <w:bCs/>
-                <w:color w:val="3D2EE8"/>
-              </w:rPr>
-              <w:t>09</w:t>
-            </w:r>
-          </w:p>
-        </w:tc>
-        <w:tc>
-          <w:tcPr>
-            <w:tcW w:w="1500" w:type="dxa"/>
-            <w:tcBorders>
-              <w:top w:val="single" w:sz="2" w:space="0" w:color="D9D5F2"/>
-              <w:left w:val="single" w:sz="2" w:space="0" w:color="D9D5F2"/>
-              <w:bottom w:val="single" w:sz="2" w:space="0" w:color="D9D5F2"/>
-              <w:right w:val="single" w:sz="2" w:space="0" w:color="D9D5F2"/>
-            </w:tcBorders>
-            <w:shd w:val="clear" w:color="auto" w:fill="FFFFFF"/>
-            <w:tcMar>
-              <w:top w:w="70" w:type="dxa"/>
-              <w:left w:w="120" w:type="dxa"/>
-              <w:bottom w:w="70" w:type="dxa"/>
-              <w:right w:w="120" w:type="dxa"/>
-            </w:tcMar>
-          </w:tcPr>
-          <w:p>
-            <w:pPr>
-              <w:rPr>
-                <w:rFonts w:ascii="Tahoma" w:hAnsi="Tahoma" w:cs="Tahoma"/>
-              </w:rPr>
-            </w:pPr>
-            <w:r>
-              <w:rPr>
-                <w:rFonts w:ascii="Tahoma" w:eastAsia="Malgun Gothic" w:hAnsi="Tahoma" w:cs="Tahoma"/>
-                <w:b/>
-                <w:bCs/>
-                <w:color w:val="000000"/>
-              </w:rPr>
-              <w:t>주말</w:t>
-            </w:r>
-          </w:p>
-          <w:p>
-            <w:pPr>
-              <w:spacing w:before="20"/>
-              <w:rPr>
-                <w:rFonts w:ascii="Tahoma" w:hAnsi="Tahoma" w:cs="Tahoma"/>
-              </w:rPr>
-            </w:pPr>
-            <w:r>
-              <w:rPr>
-                <w:rFonts w:ascii="Tahoma" w:hAnsi="Tahoma" w:cs="Tahoma"/>
-              </w:rPr>
-              <w:t>Hablar del pasado</w:t>
-            </w:r>
-          </w:p>
-        </w:tc>
-        <w:tc>
-          <w:tcPr>
-            <w:tcW w:w="2500" w:type="dxa"/>
-            <w:tcBorders>
-              <w:top w:val="single" w:sz="2" w:space="0" w:color="D9D5F2"/>
-              <w:left w:val="single" w:sz="2" w:space="0" w:color="D9D5F2"/>
-              <w:bottom w:val="single" w:sz="2" w:space="0" w:color="D9D5F2"/>
-              <w:right w:val="single" w:sz="2" w:space="0" w:color="D9D5F2"/>
-            </w:tcBorders>
-            <w:shd w:val="clear" w:color="auto" w:fill="FFFFFF"/>
-            <w:tcMar>
-              <w:top w:w="70" w:type="dxa"/>
-              <w:left w:w="120" w:type="dxa"/>
-              <w:bottom w:w="70" w:type="dxa"/>
-              <w:right w:w="120" w:type="dxa"/>
-            </w:tcMar>
-            <w:vAlign w:val="center"/>
-          </w:tcPr>
-          <w:p>
-            <w:pPr>
-              <w:rPr>
-                <w:rFonts w:ascii="Tahoma" w:hAnsi="Tahoma" w:cs="Tahoma"/>
-              </w:rPr>
-            </w:pPr>
-            <w:r>
-              <w:rPr>
-                <w:rFonts w:ascii="Tahoma" w:hAnsi="Tahoma" w:cs="Tahoma"/>
-              </w:rPr>
-              <w:t>Pasado -</w:t>
-            </w:r>
-            <w:r>
-              <w:rPr>
-                <w:rFonts w:ascii="Tahoma" w:eastAsia="Malgun Gothic" w:hAnsi="Tahoma" w:cs="Tahoma"/>
-                <w:color w:val="000000"/>
-              </w:rPr>
-              <w:t>았어요</w:t>
-            </w:r>
-            <w:r>
-              <w:rPr>
-                <w:rFonts w:ascii="Tahoma" w:hAnsi="Tahoma" w:cs="Tahoma"/>
-              </w:rPr>
-              <w:t>/</w:t>
-            </w:r>
-            <w:r>
-              <w:rPr>
-                <w:rFonts w:ascii="Tahoma" w:eastAsia="Malgun Gothic" w:hAnsi="Tahoma" w:cs="Tahoma"/>
-                <w:color w:val="000000"/>
-              </w:rPr>
-              <w:t>었어요</w:t>
-            </w:r>
-          </w:p>
-        </w:tc>
-        <w:tc>
-          <w:tcPr>
-            <w:tcW w:w="2700" w:type="dxa"/>
-            <w:tcBorders>
-              <w:top w:val="single" w:sz="2" w:space="0" w:color="D9D5F2"/>
-              <w:left w:val="single" w:sz="2" w:space="0" w:color="D9D5F2"/>
-              <w:bottom w:val="single" w:sz="2" w:space="0" w:color="D9D5F2"/>
-              <w:right w:val="single" w:sz="2" w:space="0" w:color="D9D5F2"/>
-            </w:tcBorders>
-            <w:shd w:val="clear" w:color="auto" w:fill="FFFFFF"/>
-            <w:tcMar>
-              <w:top w:w="70" w:type="dxa"/>
-              <w:left w:w="120" w:type="dxa"/>
-              <w:bottom w:w="70" w:type="dxa"/>
-              <w:right w:w="120" w:type="dxa"/>
-            </w:tcMar>
-            <w:vAlign w:val="center"/>
-          </w:tcPr>
-          <w:p>
-            <w:pPr>
-              <w:rPr>
-                <w:rFonts w:ascii="Tahoma" w:hAnsi="Tahoma" w:cs="Tahoma"/>
-              </w:rPr>
-            </w:pPr>
-            <w:r>
-              <w:rPr>
-                <w:rFonts w:ascii="Tahoma" w:hAnsi="Tahoma" w:cs="Tahoma"/>
-              </w:rPr>
-              <w:t>Tiempo libre, frecuencia</w:t>
-            </w:r>
-          </w:p>
-        </w:tc>
-        <w:tc>
-          <w:tcPr>
-            <w:tcW w:w="1900" w:type="dxa"/>
-            <w:tcBorders>
-              <w:top w:val="single" w:sz="2" w:space="0" w:color="D9D5F2"/>
-              <w:left w:val="single" w:sz="2" w:space="0" w:color="D9D5F2"/>
-              <w:bottom w:val="single" w:sz="2" w:space="0" w:color="D9D5F2"/>
-              <w:right w:val="single" w:sz="2" w:space="0" w:color="D9D5F2"/>
-            </w:tcBorders>
-            <w:shd w:val="clear" w:color="auto" w:fill="FFFFFF"/>
-            <w:tcMar>
-              <w:top w:w="70" w:type="dxa"/>
-              <w:left w:w="120" w:type="dxa"/>
-              <w:bottom w:w="70" w:type="dxa"/>
-              <w:right w:w="120" w:type="dxa"/>
-            </w:tcMar>
-            <w:vAlign w:val="center"/>
-          </w:tcPr>
-          <w:p>
-            <w:pPr>
-              <w:rPr>
-                <w:rFonts w:ascii="Tahoma" w:hAnsi="Tahoma" w:cs="Tahoma"/>
-              </w:rPr>
-            </w:pPr>
-            <w:r>
-              <w:rPr>
-                <w:rFonts w:ascii="Tahoma" w:hAnsi="Tahoma" w:cs="Tahoma"/>
-              </w:rPr>
-              <w:t>Cuenta tu fin de semana</w:t>
-            </w:r>
-          </w:p>
-        </w:tc>
-      </w:tr>
-      <w:tr>
-        <w:tblPrEx>
-          <w:tblCellMar>
-            <w:top w:w="0" w:type="dxa"/>
-            <w:bottom w:w="0" w:type="dxa"/>
-          </w:tblCellMar>
-        </w:tblPrEx>
-        <w:tc>
-          <w:tcPr>
-            <w:tcW w:w="760" w:type="dxa"/>
-            <w:tcBorders>
-              <w:top w:val="single" w:sz="2" w:space="0" w:color="D9D5F2"/>
-              <w:left w:val="single" w:sz="2" w:space="0" w:color="D9D5F2"/>
-              <w:bottom w:val="single" w:sz="2" w:space="0" w:color="D9D5F2"/>
-              <w:right w:val="single" w:sz="2" w:space="0" w:color="D9D5F2"/>
-            </w:tcBorders>
-            <w:shd w:val="clear" w:color="auto" w:fill="F7F6FE"/>
-            <w:tcMar>
-              <w:top w:w="70" w:type="dxa"/>
-              <w:left w:w="120" w:type="dxa"/>
-              <w:bottom w:w="70" w:type="dxa"/>
-              <w:right w:w="120" w:type="dxa"/>
-            </w:tcMar>
-            <w:vAlign w:val="center"/>
-          </w:tcPr>
-          <w:p>
-            <w:pPr>
-              <w:jc w:val="center"/>
-              <w:rPr>
-                <w:rFonts w:ascii="Tahoma" w:hAnsi="Tahoma" w:cs="Tahoma"/>
-              </w:rPr>
-            </w:pPr>
-            <w:r>
-              <w:rPr>
-                <w:rFonts w:ascii="Tahoma" w:hAnsi="Tahoma" w:cs="Tahoma"/>
-                <w:b/>
-                <w:bCs/>
-                <w:color w:val="3D2EE8"/>
-              </w:rPr>
-              <w:t>10</w:t>
-            </w:r>
-          </w:p>
-        </w:tc>
-        <w:tc>
-          <w:tcPr>
-            <w:tcW w:w="1500" w:type="dxa"/>
-            <w:tcBorders>
-              <w:top w:val="single" w:sz="2" w:space="0" w:color="D9D5F2"/>
-              <w:left w:val="single" w:sz="2" w:space="0" w:color="D9D5F2"/>
-              <w:bottom w:val="single" w:sz="2" w:space="0" w:color="D9D5F2"/>
-              <w:right w:val="single" w:sz="2" w:space="0" w:color="D9D5F2"/>
-            </w:tcBorders>
-            <w:shd w:val="clear" w:color="auto" w:fill="F7F6FE"/>
-            <w:tcMar>
-              <w:top w:w="70" w:type="dxa"/>
-              <w:left w:w="120" w:type="dxa"/>
-              <w:bottom w:w="70" w:type="dxa"/>
-              <w:right w:w="120" w:type="dxa"/>
-            </w:tcMar>
-          </w:tcPr>
-          <w:p>
-            <w:pPr>
-              <w:rPr>
-                <w:rFonts w:ascii="Tahoma" w:hAnsi="Tahoma" w:cs="Tahoma"/>
-              </w:rPr>
-            </w:pPr>
-            <w:r>
-              <w:rPr>
-                <w:rFonts w:ascii="Tahoma" w:eastAsia="Malgun Gothic" w:hAnsi="Tahoma" w:cs="Tahoma"/>
-                <w:b/>
-                <w:bCs/>
-                <w:color w:val="000000"/>
-              </w:rPr>
-              <w:t>휴가</w:t>
-            </w:r>
-          </w:p>
-          <w:p>
-            <w:pPr>
-              <w:spacing w:before="20"/>
-              <w:rPr>
-                <w:rFonts w:ascii="Tahoma" w:hAnsi="Tahoma" w:cs="Tahoma"/>
-              </w:rPr>
-            </w:pPr>
-            <w:r>
-              <w:rPr>
-                <w:rFonts w:ascii="Tahoma" w:hAnsi="Tahoma" w:cs="Tahoma"/>
-              </w:rPr>
-              <w:t>Futuro y deseos</w:t>
-            </w:r>
-          </w:p>
-        </w:tc>
-        <w:tc>
-          <w:tcPr>
-            <w:tcW w:w="2500" w:type="dxa"/>
-            <w:tcBorders>
-              <w:top w:val="single" w:sz="2" w:space="0" w:color="D9D5F2"/>
-              <w:left w:val="single" w:sz="2" w:space="0" w:color="D9D5F2"/>
-              <w:bottom w:val="single" w:sz="2" w:space="0" w:color="D9D5F2"/>
-              <w:right w:val="single" w:sz="2" w:space="0" w:color="D9D5F2"/>
-            </w:tcBorders>
-            <w:shd w:val="clear" w:color="auto" w:fill="F7F6FE"/>
-            <w:tcMar>
-              <w:top w:w="70" w:type="dxa"/>
-              <w:left w:w="120" w:type="dxa"/>
-              <w:bottom w:w="70" w:type="dxa"/>
-              <w:right w:w="120" w:type="dxa"/>
-            </w:tcMar>
-            <w:vAlign w:val="center"/>
-          </w:tcPr>
-          <w:p>
-            <w:pPr>
-              <w:rPr>
-                <w:rFonts w:ascii="Tahoma" w:hAnsi="Tahoma" w:cs="Tahoma"/>
-              </w:rPr>
-            </w:pPr>
-            <w:r>
-              <w:rPr>
-                <w:rFonts w:ascii="Tahoma" w:hAnsi="Tahoma" w:cs="Tahoma"/>
-              </w:rPr>
-              <w:t>-(</w:t>
-            </w:r>
-            <w:r>
-              <w:rPr>
-                <w:rFonts w:ascii="Tahoma" w:eastAsia="Malgun Gothic" w:hAnsi="Tahoma" w:cs="Tahoma"/>
-                <w:color w:val="000000"/>
-              </w:rPr>
-              <w:t>으</w:t>
-            </w:r>
-            <w:r>
-              <w:rPr>
-                <w:rFonts w:ascii="Tahoma" w:hAnsi="Tahoma" w:cs="Tahoma"/>
-              </w:rPr>
-              <w:t>)</w:t>
-            </w:r>
-            <w:r>
-              <w:rPr>
-                <w:rFonts w:ascii="Tahoma" w:eastAsia="Malgun Gothic" w:hAnsi="Tahoma" w:cs="Tahoma"/>
-                <w:color w:val="000000"/>
-              </w:rPr>
-              <w:t>ㄹ</w:t>
-            </w:r>
-            <w:r>
-              <w:rPr>
-                <w:rFonts w:ascii="Tahoma" w:hAnsi="Tahoma" w:cs="Tahoma"/>
-              </w:rPr>
-              <w:t xml:space="preserve"> </w:t>
-            </w:r>
-            <w:r>
-              <w:rPr>
-                <w:rFonts w:ascii="Tahoma" w:eastAsia="Malgun Gothic" w:hAnsi="Tahoma" w:cs="Tahoma"/>
-                <w:color w:val="000000"/>
-              </w:rPr>
-              <w:t>거예요</w:t>
-            </w:r>
-            <w:r>
-              <w:rPr>
-                <w:rFonts w:ascii="Tahoma" w:hAnsi="Tahoma" w:cs="Tahoma"/>
-              </w:rPr>
-              <w:t>; -</w:t>
-            </w:r>
-            <w:r>
-              <w:rPr>
-                <w:rFonts w:ascii="Tahoma" w:eastAsia="Malgun Gothic" w:hAnsi="Tahoma" w:cs="Tahoma"/>
-                <w:color w:val="000000"/>
-              </w:rPr>
-              <w:t>고</w:t>
-            </w:r>
-            <w:r>
-              <w:rPr>
-                <w:rFonts w:ascii="Tahoma" w:hAnsi="Tahoma" w:cs="Tahoma"/>
-              </w:rPr>
-              <w:t xml:space="preserve"> </w:t>
-            </w:r>
-            <w:r>
-              <w:rPr>
-                <w:rFonts w:ascii="Tahoma" w:eastAsia="Malgun Gothic" w:hAnsi="Tahoma" w:cs="Tahoma"/>
-                <w:color w:val="000000"/>
-              </w:rPr>
-              <w:t>싶다</w:t>
-            </w:r>
-            <w:r>
-              <w:rPr>
-                <w:rFonts w:ascii="Tahoma" w:hAnsi="Tahoma" w:cs="Tahoma"/>
-              </w:rPr>
-              <w:t xml:space="preserve">; irregular </w:t>
-            </w:r>
-            <w:r>
-              <w:rPr>
-                <w:rFonts w:ascii="Tahoma" w:eastAsia="Malgun Gothic" w:hAnsi="Tahoma" w:cs="Tahoma"/>
-                <w:color w:val="000000"/>
-              </w:rPr>
-              <w:t>ㅂ</w:t>
-            </w:r>
-          </w:p>
-        </w:tc>
-        <w:tc>
-          <w:tcPr>
-            <w:tcW w:w="2700" w:type="dxa"/>
-            <w:tcBorders>
-              <w:top w:val="single" w:sz="2" w:space="0" w:color="D9D5F2"/>
-              <w:left w:val="single" w:sz="2" w:space="0" w:color="D9D5F2"/>
-              <w:bottom w:val="single" w:sz="2" w:space="0" w:color="D9D5F2"/>
-              <w:right w:val="single" w:sz="2" w:space="0" w:color="D9D5F2"/>
-            </w:tcBorders>
-            <w:shd w:val="clear" w:color="auto" w:fill="F7F6FE"/>
-            <w:tcMar>
-              <w:top w:w="70" w:type="dxa"/>
-              <w:left w:w="120" w:type="dxa"/>
-              <w:bottom w:w="70" w:type="dxa"/>
-              <w:right w:w="120" w:type="dxa"/>
-            </w:tcMar>
-            <w:vAlign w:val="center"/>
-          </w:tcPr>
-          <w:p>
-            <w:pPr>
-              <w:rPr>
-                <w:rFonts w:ascii="Tahoma" w:hAnsi="Tahoma" w:cs="Tahoma"/>
-              </w:rPr>
-            </w:pPr>
-            <w:r>
-              <w:rPr>
-                <w:rFonts w:ascii="Tahoma" w:hAnsi="Tahoma" w:cs="Tahoma"/>
-              </w:rPr>
-              <w:t>Viajes, planes</w:t>
-            </w:r>
-          </w:p>
-        </w:tc>
-        <w:tc>
-          <w:tcPr>
-            <w:tcW w:w="1900" w:type="dxa"/>
-            <w:tcBorders>
-              <w:top w:val="single" w:sz="2" w:space="0" w:color="D9D5F2"/>
-              <w:left w:val="single" w:sz="2" w:space="0" w:color="D9D5F2"/>
-              <w:bottom w:val="single" w:sz="2" w:space="0" w:color="D9D5F2"/>
-              <w:right w:val="single" w:sz="2" w:space="0" w:color="D9D5F2"/>
-            </w:tcBorders>
-            <w:shd w:val="clear" w:color="auto" w:fill="F7F6FE"/>
-            <w:tcMar>
-              <w:top w:w="70" w:type="dxa"/>
-              <w:left w:w="120" w:type="dxa"/>
-              <w:bottom w:w="70" w:type="dxa"/>
-              <w:right w:w="120" w:type="dxa"/>
-            </w:tcMar>
-            <w:vAlign w:val="center"/>
-          </w:tcPr>
-          <w:p>
-            <w:pPr>
-              <w:rPr>
-                <w:rFonts w:ascii="Tahoma" w:hAnsi="Tahoma" w:cs="Tahoma"/>
-              </w:rPr>
-            </w:pPr>
-            <w:r>
-              <w:rPr>
-                <w:rFonts w:ascii="Tahoma" w:hAnsi="Tahoma" w:cs="Tahoma"/>
-              </w:rPr>
-              <w:t>Planea tus vacaciones</w:t>
-            </w:r>
-          </w:p>
-        </w:tc>
-      </w:tr>
-      <w:tr>
-        <w:tblPrEx>
-          <w:tblCellMar>
-            <w:top w:w="0" w:type="dxa"/>
-            <w:bottom w:w="0" w:type="dxa"/>
-          </w:tblCellMar>
-        </w:tblPrEx>
         <w:tc>
           <w:tcPr>
             <w:tcW w:w="760" w:type="dxa"/>
@@ -5435,12 +4829,6 @@
         <w:gridCol w:w="2360"/>
       </w:tblGrid>
       <w:tr>
-        <w:tblPrEx>
-          <w:tblCellMar>
-            <w:top w:w="0" w:type="dxa"/>
-            <w:bottom w:w="0" w:type="dxa"/>
-          </w:tblCellMar>
-        </w:tblPrEx>
         <w:trPr>
           <w:tblHeader/>
         </w:trPr>
@@ -5517,12 +4905,6 @@
         </w:tc>
       </w:tr>
       <w:tr>
-        <w:tblPrEx>
-          <w:tblCellMar>
-            <w:top w:w="0" w:type="dxa"/>
-            <w:bottom w:w="0" w:type="dxa"/>
-          </w:tblCellMar>
-        </w:tblPrEx>
         <w:tc>
           <w:tcPr>
             <w:tcW w:w="7000" w:type="dxa"/>
@@ -5590,12 +4972,6 @@
         </w:tc>
       </w:tr>
       <w:tr>
-        <w:tblPrEx>
-          <w:tblCellMar>
-            <w:top w:w="0" w:type="dxa"/>
-            <w:bottom w:w="0" w:type="dxa"/>
-          </w:tblCellMar>
-        </w:tblPrEx>
         <w:tc>
           <w:tcPr>
             <w:tcW w:w="7000" w:type="dxa"/>
@@ -5663,12 +5039,6 @@
         </w:tc>
       </w:tr>
       <w:tr>
-        <w:tblPrEx>
-          <w:tblCellMar>
-            <w:top w:w="0" w:type="dxa"/>
-            <w:bottom w:w="0" w:type="dxa"/>
-          </w:tblCellMar>
-        </w:tblPrEx>
         <w:tc>
           <w:tcPr>
             <w:tcW w:w="7000" w:type="dxa"/>
@@ -5878,19 +5248,7 @@
         <w:rPr>
           <w:rFonts w:ascii="Tahoma" w:hAnsi="Tahoma" w:cs="Tahoma"/>
         </w:rPr>
-        <w:t>Inversión: 8</w:t>
-      </w:r>
-      <w:r>
-        <w:rPr>
-          <w:rFonts w:ascii="Tahoma" w:hAnsi="Tahoma" w:cs="Tahoma"/>
-        </w:rPr>
-        <w:t>5.000 CLP / 89</w:t>
-      </w:r>
-      <w:r>
-        <w:rPr>
-          <w:rFonts w:ascii="Tahoma" w:hAnsi="Tahoma" w:cs="Tahoma"/>
-        </w:rPr>
-        <w:t xml:space="preserve"> USD </w:t>
+        <w:t xml:space="preserve">Inversión: 85.000 CLP / 89 USD </w:t>
       </w:r>
     </w:p>
     <w:p>
@@ -5962,19 +5320,7 @@
         <w:rPr>
           <w:rFonts w:ascii="Tahoma" w:hAnsi="Tahoma" w:cs="Tahoma"/>
         </w:rPr>
-        <w:t xml:space="preserve">PayPal — </w:t>
-      </w:r>
-      <w:r>
-        <w:rPr>
-          <w:rFonts w:ascii="Tahoma" w:hAnsi="Tahoma" w:cs="Tahoma"/>
-        </w:rPr>
-        <w:t>P</w:t>
-      </w:r>
-      <w:r>
-        <w:rPr>
-          <w:rFonts w:ascii="Tahoma" w:hAnsi="Tahoma" w:cs="Tahoma"/>
-        </w:rPr>
-        <w:t>ago internacional.</w:t>
+        <w:t>PayPal — Pago internacional.</w:t>
       </w:r>
     </w:p>
     <w:p>
@@ -6157,7 +5503,7 @@
           <w:bCs/>
           <w:i/>
           <w:iCs/>
-          <w:color w:val="C8001E"/>
+          <w:color w:val="7030A0"/>
         </w:rPr>
         <w:t>chingu</w:t>
       </w:r>
@@ -6168,25 +5514,7 @@
           <w:bCs/>
           <w:color w:val="000000"/>
         </w:rPr>
-        <w:t xml:space="preserve">.  </w:t>
-      </w:r>
-      <w:r>
-        <w:rPr>
-          <w:rFonts w:ascii="Tahoma" w:eastAsia="Malgun Gothic" w:hAnsi="Tahoma" w:cs="Tahoma"/>
-          <w:b/>
-          <w:bCs/>
-          <w:color w:val="000000"/>
-        </w:rPr>
-        <w:t>화이팅</w:t>
-      </w:r>
-      <w:r>
-        <w:rPr>
-          <w:rFonts w:ascii="Tahoma" w:eastAsia="Malgun Gothic" w:hAnsi="Tahoma" w:cs="Tahoma"/>
-          <w:b/>
-          <w:bCs/>
-          <w:color w:val="000000"/>
-        </w:rPr>
-        <w:t xml:space="preserve"> </w:t>
+        <w:t xml:space="preserve">.  화이팅 </w:t>
       </w:r>
     </w:p>
     <w:sectPr>
@@ -6982,6 +6310,7 @@
   <w:style w:type="character" w:default="1" w:styleId="DefaultParagraphFont">
     <w:name w:val="Default Paragraph Font"/>
     <w:uiPriority w:val="1"/>
+    <w:semiHidden/>
     <w:unhideWhenUsed/>
   </w:style>
   <w:style w:type="table" w:default="1" w:styleId="TableNormal">

</xml_diff>